<commit_message>
docks and gui were updated
</commit_message>
<xml_diff>
--- a/Отчёт_СПО_ЛБ1 Голубёнок, Харкевич.docx
+++ b/Отчёт_СПО_ЛБ1 Голубёнок, Харкевич.docx
@@ -4274,13 +4274,39 @@
                 <w:szCs w:val="28"/>
               </w:rPr>
             </w:pPr>
-            <w:r>
-              <w:rPr>
-                <w:rFonts w:ascii="Times New Roman" w:eastAsia="Times New Roman" w:hAnsi="Times New Roman" w:cs="Times New Roman"/>
-                <w:sz w:val="28"/>
-                <w:szCs w:val="28"/>
-              </w:rPr>
-              <w:t>if</w:t>
+            <w:proofErr w:type="gramStart"/>
+            <w:r>
+              <w:rPr>
+                <w:rFonts w:ascii="Times New Roman" w:eastAsia="Times New Roman" w:hAnsi="Times New Roman" w:cs="Times New Roman"/>
+                <w:sz w:val="28"/>
+                <w:szCs w:val="28"/>
+              </w:rPr>
+              <w:t>i</w:t>
+            </w:r>
+            <w:r>
+              <w:rPr>
+                <w:rFonts w:ascii="Times New Roman" w:eastAsia="Times New Roman" w:hAnsi="Times New Roman" w:cs="Times New Roman"/>
+                <w:sz w:val="28"/>
+                <w:szCs w:val="28"/>
+              </w:rPr>
+              <w:t>f</w:t>
+            </w:r>
+            <w:r>
+              <w:rPr>
+                <w:rFonts w:ascii="Times New Roman" w:eastAsia="Times New Roman" w:hAnsi="Times New Roman" w:cs="Times New Roman"/>
+                <w:sz w:val="28"/>
+                <w:szCs w:val="28"/>
+              </w:rPr>
+              <w:t>..</w:t>
+            </w:r>
+            <w:proofErr w:type="gramEnd"/>
+            <w:r>
+              <w:rPr>
+                <w:rFonts w:ascii="Times New Roman" w:eastAsia="Times New Roman" w:hAnsi="Times New Roman" w:cs="Times New Roman"/>
+                <w:sz w:val="28"/>
+                <w:szCs w:val="28"/>
+              </w:rPr>
+              <w:t>(else)</w:t>
             </w:r>
           </w:p>
         </w:tc>
@@ -4949,6 +4975,14 @@
                 <w:szCs w:val="28"/>
               </w:rPr>
             </w:pPr>
+            <w:r>
+              <w:rPr>
+                <w:rFonts w:ascii="Times New Roman" w:eastAsia="Times New Roman" w:hAnsi="Times New Roman" w:cs="Times New Roman"/>
+                <w:sz w:val="28"/>
+                <w:szCs w:val="28"/>
+              </w:rPr>
+              <w:t>3</w:t>
+            </w:r>
           </w:p>
         </w:tc>
       </w:tr>
@@ -5080,6 +5114,14 @@
                 <w:szCs w:val="28"/>
               </w:rPr>
             </w:pPr>
+            <w:r>
+              <w:rPr>
+                <w:rFonts w:ascii="Times New Roman" w:eastAsia="Times New Roman" w:hAnsi="Times New Roman" w:cs="Times New Roman"/>
+                <w:sz w:val="28"/>
+                <w:szCs w:val="28"/>
+              </w:rPr>
+              <w:t>1</w:t>
+            </w:r>
           </w:p>
         </w:tc>
       </w:tr>
@@ -5211,6 +5253,14 @@
                 <w:szCs w:val="28"/>
               </w:rPr>
             </w:pPr>
+            <w:r>
+              <w:rPr>
+                <w:rFonts w:ascii="Times New Roman" w:eastAsia="Times New Roman" w:hAnsi="Times New Roman" w:cs="Times New Roman"/>
+                <w:sz w:val="28"/>
+                <w:szCs w:val="28"/>
+              </w:rPr>
+              <w:t>5</w:t>
+            </w:r>
           </w:p>
         </w:tc>
       </w:tr>
@@ -5341,6 +5391,14 @@
                 <w:szCs w:val="28"/>
               </w:rPr>
             </w:pPr>
+            <w:r>
+              <w:rPr>
+                <w:rFonts w:ascii="Times New Roman" w:eastAsia="Times New Roman" w:hAnsi="Times New Roman" w:cs="Times New Roman"/>
+                <w:sz w:val="28"/>
+                <w:szCs w:val="28"/>
+              </w:rPr>
+              <w:t>2</w:t>
+            </w:r>
           </w:p>
         </w:tc>
       </w:tr>
@@ -5472,6 +5530,14 @@
                 <w:szCs w:val="28"/>
               </w:rPr>
             </w:pPr>
+            <w:r>
+              <w:rPr>
+                <w:rFonts w:ascii="Times New Roman" w:eastAsia="Times New Roman" w:hAnsi="Times New Roman" w:cs="Times New Roman"/>
+                <w:sz w:val="28"/>
+                <w:szCs w:val="28"/>
+              </w:rPr>
+              <w:t>1</w:t>
+            </w:r>
           </w:p>
         </w:tc>
       </w:tr>
@@ -5603,6 +5669,14 @@
                 <w:szCs w:val="28"/>
               </w:rPr>
             </w:pPr>
+            <w:r>
+              <w:rPr>
+                <w:rFonts w:ascii="Times New Roman" w:eastAsia="Times New Roman" w:hAnsi="Times New Roman" w:cs="Times New Roman"/>
+                <w:sz w:val="28"/>
+                <w:szCs w:val="28"/>
+              </w:rPr>
+              <w:t>8</w:t>
+            </w:r>
           </w:p>
         </w:tc>
       </w:tr>
@@ -5734,6 +5808,14 @@
                 <w:szCs w:val="28"/>
               </w:rPr>
             </w:pPr>
+            <w:r>
+              <w:rPr>
+                <w:rFonts w:ascii="Times New Roman" w:eastAsia="Times New Roman" w:hAnsi="Times New Roman" w:cs="Times New Roman"/>
+                <w:sz w:val="28"/>
+                <w:szCs w:val="28"/>
+              </w:rPr>
+              <w:t>6</w:t>
+            </w:r>
           </w:p>
         </w:tc>
       </w:tr>
@@ -5869,6 +5951,14 @@
                 <w:szCs w:val="28"/>
               </w:rPr>
             </w:pPr>
+            <w:r>
+              <w:rPr>
+                <w:rFonts w:ascii="Times New Roman" w:eastAsia="Times New Roman" w:hAnsi="Times New Roman" w:cs="Times New Roman"/>
+                <w:sz w:val="28"/>
+                <w:szCs w:val="28"/>
+              </w:rPr>
+              <w:t>8</w:t>
+            </w:r>
           </w:p>
         </w:tc>
       </w:tr>
@@ -6001,6 +6091,14 @@
                 <w:szCs w:val="28"/>
               </w:rPr>
             </w:pPr>
+            <w:r>
+              <w:rPr>
+                <w:rFonts w:ascii="Times New Roman" w:eastAsia="Times New Roman" w:hAnsi="Times New Roman" w:cs="Times New Roman"/>
+                <w:sz w:val="28"/>
+                <w:szCs w:val="28"/>
+              </w:rPr>
+              <w:t>1</w:t>
+            </w:r>
           </w:p>
         </w:tc>
       </w:tr>
@@ -6132,6 +6230,14 @@
                 <w:szCs w:val="28"/>
               </w:rPr>
             </w:pPr>
+            <w:r>
+              <w:rPr>
+                <w:rFonts w:ascii="Times New Roman" w:eastAsia="Times New Roman" w:hAnsi="Times New Roman" w:cs="Times New Roman"/>
+                <w:sz w:val="28"/>
+                <w:szCs w:val="28"/>
+              </w:rPr>
+              <w:t>1</w:t>
+            </w:r>
           </w:p>
         </w:tc>
       </w:tr>
@@ -6266,6 +6372,14 @@
                 <w:szCs w:val="28"/>
               </w:rPr>
             </w:pPr>
+            <w:r>
+              <w:rPr>
+                <w:rFonts w:ascii="Times New Roman" w:eastAsia="Times New Roman" w:hAnsi="Times New Roman" w:cs="Times New Roman"/>
+                <w:sz w:val="28"/>
+                <w:szCs w:val="28"/>
+              </w:rPr>
+              <w:t>11</w:t>
+            </w:r>
           </w:p>
         </w:tc>
       </w:tr>
@@ -6397,6 +6511,14 @@
                 <w:szCs w:val="28"/>
               </w:rPr>
             </w:pPr>
+            <w:r>
+              <w:rPr>
+                <w:rFonts w:ascii="Times New Roman" w:eastAsia="Times New Roman" w:hAnsi="Times New Roman" w:cs="Times New Roman"/>
+                <w:sz w:val="28"/>
+                <w:szCs w:val="28"/>
+              </w:rPr>
+              <w:t>2</w:t>
+            </w:r>
           </w:p>
         </w:tc>
       </w:tr>
@@ -6519,17 +6641,21 @@
         <w:tc>
           <w:tcPr>
             <w:tcW w:w="912" w:type="dxa"/>
-          </w:tcPr>
-          <w:p>
-            <w:pPr>
-              <w:pStyle w:val="a8"/>
-              <w:ind w:left="0"/>
-              <w:rPr>
-                <w:rFonts w:ascii="Times New Roman" w:eastAsia="Times New Roman" w:hAnsi="Times New Roman" w:cs="Times New Roman"/>
-                <w:sz w:val="28"/>
-                <w:szCs w:val="28"/>
-              </w:rPr>
-            </w:pPr>
+            <w:vAlign w:val="center"/>
+          </w:tcPr>
+          <w:p>
+            <w:pPr>
+              <w:pStyle w:val="a8"/>
+              <w:ind w:left="0"/>
+              <w:rPr>
+                <w:rFonts w:ascii="Times New Roman" w:eastAsia="Times New Roman" w:hAnsi="Times New Roman" w:cs="Times New Roman"/>
+                <w:sz w:val="28"/>
+                <w:szCs w:val="28"/>
+              </w:rPr>
+            </w:pPr>
+            <w:r>
+              <w:t>14</w:t>
+            </w:r>
           </w:p>
         </w:tc>
       </w:tr>
@@ -6652,17 +6778,21 @@
         <w:tc>
           <w:tcPr>
             <w:tcW w:w="912" w:type="dxa"/>
-          </w:tcPr>
-          <w:p>
-            <w:pPr>
-              <w:pStyle w:val="a8"/>
-              <w:ind w:left="0"/>
-              <w:rPr>
-                <w:rFonts w:ascii="Times New Roman" w:eastAsia="Times New Roman" w:hAnsi="Times New Roman" w:cs="Times New Roman"/>
-                <w:sz w:val="28"/>
-                <w:szCs w:val="28"/>
-              </w:rPr>
-            </w:pPr>
+            <w:vAlign w:val="center"/>
+          </w:tcPr>
+          <w:p>
+            <w:pPr>
+              <w:pStyle w:val="a8"/>
+              <w:ind w:left="0"/>
+              <w:rPr>
+                <w:rFonts w:ascii="Times New Roman" w:eastAsia="Times New Roman" w:hAnsi="Times New Roman" w:cs="Times New Roman"/>
+                <w:sz w:val="28"/>
+                <w:szCs w:val="28"/>
+              </w:rPr>
+            </w:pPr>
+            <w:r>
+              <w:t>3</w:t>
+            </w:r>
           </w:p>
         </w:tc>
       </w:tr>
@@ -6783,17 +6913,21 @@
         <w:tc>
           <w:tcPr>
             <w:tcW w:w="912" w:type="dxa"/>
-          </w:tcPr>
-          <w:p>
-            <w:pPr>
-              <w:pStyle w:val="a8"/>
-              <w:ind w:left="0"/>
-              <w:rPr>
-                <w:rFonts w:ascii="Times New Roman" w:eastAsia="Times New Roman" w:hAnsi="Times New Roman" w:cs="Times New Roman"/>
-                <w:sz w:val="28"/>
-                <w:szCs w:val="28"/>
-              </w:rPr>
-            </w:pPr>
+            <w:vAlign w:val="center"/>
+          </w:tcPr>
+          <w:p>
+            <w:pPr>
+              <w:pStyle w:val="a8"/>
+              <w:ind w:left="0"/>
+              <w:rPr>
+                <w:rFonts w:ascii="Times New Roman" w:eastAsia="Times New Roman" w:hAnsi="Times New Roman" w:cs="Times New Roman"/>
+                <w:sz w:val="28"/>
+                <w:szCs w:val="28"/>
+              </w:rPr>
+            </w:pPr>
+            <w:r>
+              <w:t>1</w:t>
+            </w:r>
           </w:p>
         </w:tc>
       </w:tr>
@@ -6913,17 +7047,21 @@
         <w:tc>
           <w:tcPr>
             <w:tcW w:w="912" w:type="dxa"/>
-          </w:tcPr>
-          <w:p>
-            <w:pPr>
-              <w:pStyle w:val="a8"/>
-              <w:ind w:left="0"/>
-              <w:rPr>
-                <w:rFonts w:ascii="Times New Roman" w:eastAsia="Times New Roman" w:hAnsi="Times New Roman" w:cs="Times New Roman"/>
-                <w:sz w:val="28"/>
-                <w:szCs w:val="28"/>
-              </w:rPr>
-            </w:pPr>
+            <w:vAlign w:val="center"/>
+          </w:tcPr>
+          <w:p>
+            <w:pPr>
+              <w:pStyle w:val="a8"/>
+              <w:ind w:left="0"/>
+              <w:rPr>
+                <w:rFonts w:ascii="Times New Roman" w:eastAsia="Times New Roman" w:hAnsi="Times New Roman" w:cs="Times New Roman"/>
+                <w:sz w:val="28"/>
+                <w:szCs w:val="28"/>
+              </w:rPr>
+            </w:pPr>
+            <w:r>
+              <w:t>1</w:t>
+            </w:r>
           </w:p>
         </w:tc>
       </w:tr>
@@ -7043,17 +7181,21 @@
         <w:tc>
           <w:tcPr>
             <w:tcW w:w="912" w:type="dxa"/>
-          </w:tcPr>
-          <w:p>
-            <w:pPr>
-              <w:pStyle w:val="a8"/>
-              <w:ind w:left="0"/>
-              <w:rPr>
-                <w:rFonts w:ascii="Times New Roman" w:eastAsia="Times New Roman" w:hAnsi="Times New Roman" w:cs="Times New Roman"/>
-                <w:sz w:val="28"/>
-                <w:szCs w:val="28"/>
-              </w:rPr>
-            </w:pPr>
+            <w:vAlign w:val="center"/>
+          </w:tcPr>
+          <w:p>
+            <w:pPr>
+              <w:pStyle w:val="a8"/>
+              <w:ind w:left="0"/>
+              <w:rPr>
+                <w:rFonts w:ascii="Times New Roman" w:eastAsia="Times New Roman" w:hAnsi="Times New Roman" w:cs="Times New Roman"/>
+                <w:sz w:val="28"/>
+                <w:szCs w:val="28"/>
+              </w:rPr>
+            </w:pPr>
+            <w:r>
+              <w:t>8</w:t>
+            </w:r>
           </w:p>
         </w:tc>
       </w:tr>
@@ -7173,17 +7315,21 @@
         <w:tc>
           <w:tcPr>
             <w:tcW w:w="912" w:type="dxa"/>
-          </w:tcPr>
-          <w:p>
-            <w:pPr>
-              <w:pStyle w:val="a8"/>
-              <w:ind w:left="0"/>
-              <w:rPr>
-                <w:rFonts w:ascii="Times New Roman" w:eastAsia="Times New Roman" w:hAnsi="Times New Roman" w:cs="Times New Roman"/>
-                <w:sz w:val="28"/>
-                <w:szCs w:val="28"/>
-              </w:rPr>
-            </w:pPr>
+            <w:vAlign w:val="center"/>
+          </w:tcPr>
+          <w:p>
+            <w:pPr>
+              <w:pStyle w:val="a8"/>
+              <w:ind w:left="0"/>
+              <w:rPr>
+                <w:rFonts w:ascii="Times New Roman" w:eastAsia="Times New Roman" w:hAnsi="Times New Roman" w:cs="Times New Roman"/>
+                <w:sz w:val="28"/>
+                <w:szCs w:val="28"/>
+              </w:rPr>
+            </w:pPr>
+            <w:r>
+              <w:t>3</w:t>
+            </w:r>
           </w:p>
         </w:tc>
       </w:tr>
@@ -7271,6 +7417,14 @@
                 <w:lang w:val="ru-RU"/>
               </w:rPr>
             </w:pPr>
+            <w:r>
+              <w:rPr>
+                <w:rFonts w:ascii="Times New Roman" w:hAnsi="Times New Roman" w:cs="Times New Roman"/>
+                <w:sz w:val="28"/>
+                <w:szCs w:val="28"/>
+              </w:rPr>
+              <w:t>23</w:t>
+            </w:r>
           </w:p>
         </w:tc>
         <w:tc>
@@ -7296,17 +7450,21 @@
         <w:tc>
           <w:tcPr>
             <w:tcW w:w="912" w:type="dxa"/>
-          </w:tcPr>
-          <w:p>
-            <w:pPr>
-              <w:pStyle w:val="a8"/>
-              <w:ind w:left="0"/>
-              <w:rPr>
-                <w:rFonts w:ascii="Times New Roman" w:eastAsia="Times New Roman" w:hAnsi="Times New Roman" w:cs="Times New Roman"/>
-                <w:sz w:val="28"/>
-                <w:szCs w:val="28"/>
-              </w:rPr>
-            </w:pPr>
+            <w:vAlign w:val="center"/>
+          </w:tcPr>
+          <w:p>
+            <w:pPr>
+              <w:pStyle w:val="a8"/>
+              <w:ind w:left="0"/>
+              <w:rPr>
+                <w:rFonts w:ascii="Times New Roman" w:eastAsia="Times New Roman" w:hAnsi="Times New Roman" w:cs="Times New Roman"/>
+                <w:sz w:val="28"/>
+                <w:szCs w:val="28"/>
+              </w:rPr>
+            </w:pPr>
+            <w:r>
+              <w:t>2</w:t>
+            </w:r>
           </w:p>
         </w:tc>
       </w:tr>
@@ -7393,6 +7551,14 @@
                 <w:szCs w:val="28"/>
               </w:rPr>
             </w:pPr>
+            <w:r>
+              <w:rPr>
+                <w:rFonts w:ascii="Times New Roman" w:hAnsi="Times New Roman" w:cs="Times New Roman"/>
+                <w:sz w:val="28"/>
+                <w:szCs w:val="28"/>
+              </w:rPr>
+              <w:t>24</w:t>
+            </w:r>
           </w:p>
         </w:tc>
         <w:tc>
@@ -7420,17 +7586,21 @@
         <w:tc>
           <w:tcPr>
             <w:tcW w:w="912" w:type="dxa"/>
-          </w:tcPr>
-          <w:p>
-            <w:pPr>
-              <w:pStyle w:val="a8"/>
-              <w:ind w:left="0"/>
-              <w:rPr>
-                <w:rFonts w:ascii="Times New Roman" w:eastAsia="Times New Roman" w:hAnsi="Times New Roman" w:cs="Times New Roman"/>
-                <w:sz w:val="28"/>
-                <w:szCs w:val="28"/>
-              </w:rPr>
-            </w:pPr>
+            <w:vAlign w:val="center"/>
+          </w:tcPr>
+          <w:p>
+            <w:pPr>
+              <w:pStyle w:val="a8"/>
+              <w:ind w:left="0"/>
+              <w:rPr>
+                <w:rFonts w:ascii="Times New Roman" w:eastAsia="Times New Roman" w:hAnsi="Times New Roman" w:cs="Times New Roman"/>
+                <w:sz w:val="28"/>
+                <w:szCs w:val="28"/>
+              </w:rPr>
+            </w:pPr>
+            <w:r>
+              <w:t>9</w:t>
+            </w:r>
           </w:p>
         </w:tc>
       </w:tr>
@@ -7517,6 +7687,14 @@
                 <w:szCs w:val="28"/>
               </w:rPr>
             </w:pPr>
+            <w:r>
+              <w:rPr>
+                <w:rFonts w:ascii="Times New Roman" w:hAnsi="Times New Roman" w:cs="Times New Roman"/>
+                <w:sz w:val="28"/>
+                <w:szCs w:val="28"/>
+              </w:rPr>
+              <w:t>25</w:t>
+            </w:r>
           </w:p>
         </w:tc>
         <w:tc>
@@ -7542,17 +7720,21 @@
         <w:tc>
           <w:tcPr>
             <w:tcW w:w="912" w:type="dxa"/>
-          </w:tcPr>
-          <w:p>
-            <w:pPr>
-              <w:pStyle w:val="a8"/>
-              <w:ind w:left="0"/>
-              <w:rPr>
-                <w:rFonts w:ascii="Times New Roman" w:eastAsia="Times New Roman" w:hAnsi="Times New Roman" w:cs="Times New Roman"/>
-                <w:sz w:val="28"/>
-                <w:szCs w:val="28"/>
-              </w:rPr>
-            </w:pPr>
+            <w:vAlign w:val="center"/>
+          </w:tcPr>
+          <w:p>
+            <w:pPr>
+              <w:pStyle w:val="a8"/>
+              <w:ind w:left="0"/>
+              <w:rPr>
+                <w:rFonts w:ascii="Times New Roman" w:eastAsia="Times New Roman" w:hAnsi="Times New Roman" w:cs="Times New Roman"/>
+                <w:sz w:val="28"/>
+                <w:szCs w:val="28"/>
+              </w:rPr>
+            </w:pPr>
+            <w:r>
+              <w:t>7</w:t>
+            </w:r>
           </w:p>
         </w:tc>
       </w:tr>
@@ -7639,6 +7821,14 @@
                 <w:szCs w:val="28"/>
               </w:rPr>
             </w:pPr>
+            <w:r>
+              <w:rPr>
+                <w:rFonts w:ascii="Times New Roman" w:hAnsi="Times New Roman" w:cs="Times New Roman"/>
+                <w:sz w:val="28"/>
+                <w:szCs w:val="28"/>
+              </w:rPr>
+              <w:t>26</w:t>
+            </w:r>
           </w:p>
         </w:tc>
         <w:tc>
@@ -7664,17 +7854,21 @@
         <w:tc>
           <w:tcPr>
             <w:tcW w:w="912" w:type="dxa"/>
-          </w:tcPr>
-          <w:p>
-            <w:pPr>
-              <w:pStyle w:val="a8"/>
-              <w:ind w:left="0"/>
-              <w:rPr>
-                <w:rFonts w:ascii="Times New Roman" w:eastAsia="Times New Roman" w:hAnsi="Times New Roman" w:cs="Times New Roman"/>
-                <w:sz w:val="28"/>
-                <w:szCs w:val="28"/>
-              </w:rPr>
-            </w:pPr>
+            <w:vAlign w:val="center"/>
+          </w:tcPr>
+          <w:p>
+            <w:pPr>
+              <w:pStyle w:val="a8"/>
+              <w:ind w:left="0"/>
+              <w:rPr>
+                <w:rFonts w:ascii="Times New Roman" w:eastAsia="Times New Roman" w:hAnsi="Times New Roman" w:cs="Times New Roman"/>
+                <w:sz w:val="28"/>
+                <w:szCs w:val="28"/>
+              </w:rPr>
+            </w:pPr>
+            <w:r>
+              <w:t>1</w:t>
+            </w:r>
           </w:p>
         </w:tc>
       </w:tr>
@@ -7761,6 +7955,14 @@
                 <w:szCs w:val="28"/>
               </w:rPr>
             </w:pPr>
+            <w:r>
+              <w:rPr>
+                <w:rFonts w:ascii="Times New Roman" w:hAnsi="Times New Roman" w:cs="Times New Roman"/>
+                <w:sz w:val="28"/>
+                <w:szCs w:val="28"/>
+              </w:rPr>
+              <w:t>27</w:t>
+            </w:r>
           </w:p>
         </w:tc>
         <w:tc>
@@ -7786,17 +7988,21 @@
         <w:tc>
           <w:tcPr>
             <w:tcW w:w="912" w:type="dxa"/>
-          </w:tcPr>
-          <w:p>
-            <w:pPr>
-              <w:pStyle w:val="a8"/>
-              <w:ind w:left="0"/>
-              <w:rPr>
-                <w:rFonts w:ascii="Times New Roman" w:eastAsia="Times New Roman" w:hAnsi="Times New Roman" w:cs="Times New Roman"/>
-                <w:sz w:val="28"/>
-                <w:szCs w:val="28"/>
-              </w:rPr>
-            </w:pPr>
+            <w:vAlign w:val="center"/>
+          </w:tcPr>
+          <w:p>
+            <w:pPr>
+              <w:pStyle w:val="a8"/>
+              <w:ind w:left="0"/>
+              <w:rPr>
+                <w:rFonts w:ascii="Times New Roman" w:eastAsia="Times New Roman" w:hAnsi="Times New Roman" w:cs="Times New Roman"/>
+                <w:sz w:val="28"/>
+                <w:szCs w:val="28"/>
+              </w:rPr>
+            </w:pPr>
+            <w:r>
+              <w:t>6</w:t>
+            </w:r>
           </w:p>
         </w:tc>
       </w:tr>
@@ -7883,6 +8089,14 @@
                 <w:szCs w:val="28"/>
               </w:rPr>
             </w:pPr>
+            <w:r>
+              <w:rPr>
+                <w:rFonts w:ascii="Times New Roman" w:hAnsi="Times New Roman" w:cs="Times New Roman"/>
+                <w:sz w:val="28"/>
+                <w:szCs w:val="28"/>
+              </w:rPr>
+              <w:t>28</w:t>
+            </w:r>
           </w:p>
         </w:tc>
         <w:tc>
@@ -7910,17 +8124,21 @@
         <w:tc>
           <w:tcPr>
             <w:tcW w:w="912" w:type="dxa"/>
-          </w:tcPr>
-          <w:p>
-            <w:pPr>
-              <w:pStyle w:val="a8"/>
-              <w:ind w:left="0"/>
-              <w:rPr>
-                <w:rFonts w:ascii="Times New Roman" w:eastAsia="Times New Roman" w:hAnsi="Times New Roman" w:cs="Times New Roman"/>
-                <w:sz w:val="28"/>
-                <w:szCs w:val="28"/>
-              </w:rPr>
-            </w:pPr>
+            <w:vAlign w:val="center"/>
+          </w:tcPr>
+          <w:p>
+            <w:pPr>
+              <w:pStyle w:val="a8"/>
+              <w:ind w:left="0"/>
+              <w:rPr>
+                <w:rFonts w:ascii="Times New Roman" w:eastAsia="Times New Roman" w:hAnsi="Times New Roman" w:cs="Times New Roman"/>
+                <w:sz w:val="28"/>
+                <w:szCs w:val="28"/>
+              </w:rPr>
+            </w:pPr>
+            <w:r>
+              <w:t>4</w:t>
+            </w:r>
           </w:p>
         </w:tc>
       </w:tr>
@@ -8002,6 +8220,14 @@
                 <w:szCs w:val="28"/>
               </w:rPr>
             </w:pPr>
+            <w:r>
+              <w:rPr>
+                <w:rFonts w:ascii="Times New Roman" w:hAnsi="Times New Roman" w:cs="Times New Roman"/>
+                <w:sz w:val="28"/>
+                <w:szCs w:val="28"/>
+              </w:rPr>
+              <w:t>29</w:t>
+            </w:r>
           </w:p>
         </w:tc>
         <w:tc>
@@ -8027,17 +8253,21 @@
         <w:tc>
           <w:tcPr>
             <w:tcW w:w="912" w:type="dxa"/>
-          </w:tcPr>
-          <w:p>
-            <w:pPr>
-              <w:pStyle w:val="a8"/>
-              <w:ind w:left="0"/>
-              <w:rPr>
-                <w:rFonts w:ascii="Times New Roman" w:eastAsia="Times New Roman" w:hAnsi="Times New Roman" w:cs="Times New Roman"/>
-                <w:sz w:val="28"/>
-                <w:szCs w:val="28"/>
-              </w:rPr>
-            </w:pPr>
+            <w:vAlign w:val="center"/>
+          </w:tcPr>
+          <w:p>
+            <w:pPr>
+              <w:pStyle w:val="a8"/>
+              <w:ind w:left="0"/>
+              <w:rPr>
+                <w:rFonts w:ascii="Times New Roman" w:eastAsia="Times New Roman" w:hAnsi="Times New Roman" w:cs="Times New Roman"/>
+                <w:sz w:val="28"/>
+                <w:szCs w:val="28"/>
+              </w:rPr>
+            </w:pPr>
+            <w:r>
+              <w:t>1</w:t>
+            </w:r>
           </w:p>
         </w:tc>
       </w:tr>
@@ -8129,6 +8359,14 @@
                 <w:szCs w:val="28"/>
               </w:rPr>
             </w:pPr>
+            <w:r>
+              <w:rPr>
+                <w:rFonts w:ascii="Times New Roman" w:eastAsia="Times New Roman" w:hAnsi="Times New Roman" w:cs="Times New Roman"/>
+                <w:sz w:val="28"/>
+                <w:szCs w:val="28"/>
+              </w:rPr>
+              <w:t>30</w:t>
+            </w:r>
           </w:p>
         </w:tc>
         <w:tc>
@@ -8154,6 +8392,7 @@
         <w:tc>
           <w:tcPr>
             <w:tcW w:w="912" w:type="dxa"/>
+            <w:vAlign w:val="center"/>
           </w:tcPr>
           <w:p>
             <w:pPr>
@@ -8167,6 +8406,9 @@
                 <w:szCs w:val="28"/>
               </w:rPr>
             </w:pPr>
+            <w:r>
+              <w:t>2</w:t>
+            </w:r>
           </w:p>
         </w:tc>
       </w:tr>
@@ -8258,6 +8500,14 @@
                 <w:szCs w:val="28"/>
               </w:rPr>
             </w:pPr>
+            <w:r>
+              <w:rPr>
+                <w:rFonts w:ascii="Times New Roman" w:eastAsia="Times New Roman" w:hAnsi="Times New Roman" w:cs="Times New Roman"/>
+                <w:sz w:val="28"/>
+                <w:szCs w:val="28"/>
+              </w:rPr>
+              <w:t>31</w:t>
+            </w:r>
           </w:p>
         </w:tc>
         <w:tc>
@@ -8285,6 +8535,7 @@
         <w:tc>
           <w:tcPr>
             <w:tcW w:w="912" w:type="dxa"/>
+            <w:vAlign w:val="center"/>
           </w:tcPr>
           <w:p>
             <w:pPr>
@@ -8298,6 +8549,9 @@
                 <w:szCs w:val="28"/>
               </w:rPr>
             </w:pPr>
+            <w:r>
+              <w:t>9</w:t>
+            </w:r>
           </w:p>
         </w:tc>
       </w:tr>
@@ -8389,6 +8643,14 @@
                 <w:szCs w:val="28"/>
               </w:rPr>
             </w:pPr>
+            <w:r>
+              <w:rPr>
+                <w:rFonts w:ascii="Times New Roman" w:eastAsia="Times New Roman" w:hAnsi="Times New Roman" w:cs="Times New Roman"/>
+                <w:sz w:val="28"/>
+                <w:szCs w:val="28"/>
+              </w:rPr>
+              <w:t>32</w:t>
+            </w:r>
           </w:p>
         </w:tc>
         <w:tc>
@@ -8414,6 +8676,7 @@
         <w:tc>
           <w:tcPr>
             <w:tcW w:w="912" w:type="dxa"/>
+            <w:vAlign w:val="center"/>
           </w:tcPr>
           <w:p>
             <w:pPr>
@@ -8427,6 +8690,9 @@
                 <w:szCs w:val="28"/>
               </w:rPr>
             </w:pPr>
+            <w:r>
+              <w:t>3</w:t>
+            </w:r>
           </w:p>
         </w:tc>
       </w:tr>
@@ -8518,6 +8784,14 @@
                 <w:szCs w:val="28"/>
               </w:rPr>
             </w:pPr>
+            <w:r>
+              <w:rPr>
+                <w:rFonts w:ascii="Times New Roman" w:eastAsia="Times New Roman" w:hAnsi="Times New Roman" w:cs="Times New Roman"/>
+                <w:sz w:val="28"/>
+                <w:szCs w:val="28"/>
+              </w:rPr>
+              <w:t>33</w:t>
+            </w:r>
           </w:p>
         </w:tc>
         <w:tc>
@@ -8543,6 +8817,7 @@
         <w:tc>
           <w:tcPr>
             <w:tcW w:w="912" w:type="dxa"/>
+            <w:vAlign w:val="center"/>
           </w:tcPr>
           <w:p>
             <w:pPr>
@@ -8556,6 +8831,9 @@
                 <w:szCs w:val="28"/>
               </w:rPr>
             </w:pPr>
+            <w:r>
+              <w:t>2</w:t>
+            </w:r>
           </w:p>
         </w:tc>
       </w:tr>
@@ -8647,6 +8925,14 @@
                 <w:szCs w:val="28"/>
               </w:rPr>
             </w:pPr>
+            <w:r>
+              <w:rPr>
+                <w:rFonts w:ascii="Times New Roman" w:eastAsia="Times New Roman" w:hAnsi="Times New Roman" w:cs="Times New Roman"/>
+                <w:sz w:val="28"/>
+                <w:szCs w:val="28"/>
+              </w:rPr>
+              <w:t>34</w:t>
+            </w:r>
           </w:p>
         </w:tc>
         <w:tc>
@@ -8672,6 +8958,7 @@
         <w:tc>
           <w:tcPr>
             <w:tcW w:w="912" w:type="dxa"/>
+            <w:vAlign w:val="center"/>
           </w:tcPr>
           <w:p>
             <w:pPr>
@@ -8685,6 +8972,9 @@
                 <w:szCs w:val="28"/>
               </w:rPr>
             </w:pPr>
+            <w:r>
+              <w:t>1</w:t>
+            </w:r>
           </w:p>
         </w:tc>
       </w:tr>
@@ -8776,6 +9066,14 @@
                 <w:szCs w:val="28"/>
               </w:rPr>
             </w:pPr>
+            <w:r>
+              <w:rPr>
+                <w:rFonts w:ascii="Times New Roman" w:eastAsia="Times New Roman" w:hAnsi="Times New Roman" w:cs="Times New Roman"/>
+                <w:sz w:val="28"/>
+                <w:szCs w:val="28"/>
+              </w:rPr>
+              <w:t>35</w:t>
+            </w:r>
           </w:p>
         </w:tc>
         <w:tc>
@@ -8801,6 +9099,7 @@
         <w:tc>
           <w:tcPr>
             <w:tcW w:w="912" w:type="dxa"/>
+            <w:vAlign w:val="center"/>
           </w:tcPr>
           <w:p>
             <w:pPr>
@@ -8814,6 +9113,9 @@
                 <w:szCs w:val="28"/>
               </w:rPr>
             </w:pPr>
+            <w:r>
+              <w:t>1</w:t>
+            </w:r>
           </w:p>
         </w:tc>
       </w:tr>
@@ -8905,6 +9207,14 @@
                 <w:szCs w:val="28"/>
               </w:rPr>
             </w:pPr>
+            <w:r>
+              <w:rPr>
+                <w:rFonts w:ascii="Times New Roman" w:eastAsia="Times New Roman" w:hAnsi="Times New Roman" w:cs="Times New Roman"/>
+                <w:sz w:val="28"/>
+                <w:szCs w:val="28"/>
+              </w:rPr>
+              <w:t>36</w:t>
+            </w:r>
           </w:p>
         </w:tc>
         <w:tc>
@@ -8930,6 +9240,7 @@
         <w:tc>
           <w:tcPr>
             <w:tcW w:w="912" w:type="dxa"/>
+            <w:vAlign w:val="center"/>
           </w:tcPr>
           <w:p>
             <w:pPr>
@@ -8943,6 +9254,9 @@
                 <w:szCs w:val="28"/>
               </w:rPr>
             </w:pPr>
+            <w:r>
+              <w:t>2</w:t>
+            </w:r>
           </w:p>
         </w:tc>
       </w:tr>
@@ -9034,6 +9348,14 @@
                 <w:szCs w:val="28"/>
               </w:rPr>
             </w:pPr>
+            <w:r>
+              <w:rPr>
+                <w:rFonts w:ascii="Times New Roman" w:eastAsia="Times New Roman" w:hAnsi="Times New Roman" w:cs="Times New Roman"/>
+                <w:sz w:val="28"/>
+                <w:szCs w:val="28"/>
+              </w:rPr>
+              <w:t>37</w:t>
+            </w:r>
           </w:p>
         </w:tc>
         <w:tc>
@@ -9059,6 +9381,7 @@
         <w:tc>
           <w:tcPr>
             <w:tcW w:w="912" w:type="dxa"/>
+            <w:vAlign w:val="center"/>
           </w:tcPr>
           <w:p>
             <w:pPr>
@@ -9072,6 +9395,9 @@
                 <w:szCs w:val="28"/>
               </w:rPr>
             </w:pPr>
+            <w:r>
+              <w:t>1</w:t>
+            </w:r>
           </w:p>
         </w:tc>
       </w:tr>
@@ -9163,6 +9489,14 @@
                 <w:szCs w:val="28"/>
               </w:rPr>
             </w:pPr>
+            <w:r>
+              <w:rPr>
+                <w:rFonts w:ascii="Times New Roman" w:eastAsia="Times New Roman" w:hAnsi="Times New Roman" w:cs="Times New Roman"/>
+                <w:sz w:val="28"/>
+                <w:szCs w:val="28"/>
+              </w:rPr>
+              <w:t>38</w:t>
+            </w:r>
           </w:p>
         </w:tc>
         <w:tc>
@@ -9188,6 +9522,7 @@
         <w:tc>
           <w:tcPr>
             <w:tcW w:w="912" w:type="dxa"/>
+            <w:vAlign w:val="center"/>
           </w:tcPr>
           <w:p>
             <w:pPr>
@@ -9201,6 +9536,9 @@
                 <w:szCs w:val="28"/>
               </w:rPr>
             </w:pPr>
+            <w:r>
+              <w:t>1</w:t>
+            </w:r>
           </w:p>
         </w:tc>
       </w:tr>
@@ -9293,6 +9631,14 @@
                 <w:szCs w:val="28"/>
               </w:rPr>
             </w:pPr>
+            <w:r>
+              <w:rPr>
+                <w:rFonts w:ascii="Times New Roman" w:eastAsia="Times New Roman" w:hAnsi="Times New Roman" w:cs="Times New Roman"/>
+                <w:sz w:val="28"/>
+                <w:szCs w:val="28"/>
+              </w:rPr>
+              <w:t>39</w:t>
+            </w:r>
           </w:p>
         </w:tc>
         <w:tc>
@@ -9318,6 +9664,7 @@
         <w:tc>
           <w:tcPr>
             <w:tcW w:w="912" w:type="dxa"/>
+            <w:vAlign w:val="center"/>
           </w:tcPr>
           <w:p>
             <w:pPr>
@@ -9331,6 +9678,9 @@
                 <w:szCs w:val="28"/>
               </w:rPr>
             </w:pPr>
+            <w:r>
+              <w:t>1</w:t>
+            </w:r>
           </w:p>
         </w:tc>
       </w:tr>
@@ -9423,6 +9773,14 @@
                 <w:szCs w:val="28"/>
               </w:rPr>
             </w:pPr>
+            <w:r>
+              <w:rPr>
+                <w:rFonts w:ascii="Times New Roman" w:eastAsia="Times New Roman" w:hAnsi="Times New Roman" w:cs="Times New Roman"/>
+                <w:sz w:val="28"/>
+                <w:szCs w:val="28"/>
+              </w:rPr>
+              <w:t>40</w:t>
+            </w:r>
           </w:p>
         </w:tc>
         <w:tc>
@@ -9448,6 +9806,7 @@
         <w:tc>
           <w:tcPr>
             <w:tcW w:w="912" w:type="dxa"/>
+            <w:vAlign w:val="center"/>
           </w:tcPr>
           <w:p>
             <w:pPr>
@@ -9461,6 +9820,9 @@
                 <w:szCs w:val="28"/>
               </w:rPr>
             </w:pPr>
+            <w:r>
+              <w:t>1</w:t>
+            </w:r>
           </w:p>
         </w:tc>
       </w:tr>
@@ -9554,6 +9916,14 @@
                 <w:szCs w:val="28"/>
               </w:rPr>
             </w:pPr>
+            <w:r>
+              <w:rPr>
+                <w:rFonts w:ascii="Times New Roman" w:eastAsia="Times New Roman" w:hAnsi="Times New Roman" w:cs="Times New Roman"/>
+                <w:sz w:val="28"/>
+                <w:szCs w:val="28"/>
+              </w:rPr>
+              <w:t>41</w:t>
+            </w:r>
           </w:p>
         </w:tc>
         <w:tc>
@@ -9579,6 +9949,7 @@
         <w:tc>
           <w:tcPr>
             <w:tcW w:w="912" w:type="dxa"/>
+            <w:vAlign w:val="center"/>
           </w:tcPr>
           <w:p>
             <w:pPr>
@@ -9592,6 +9963,9 @@
                 <w:szCs w:val="28"/>
               </w:rPr>
             </w:pPr>
+            <w:r>
+              <w:t>1</w:t>
+            </w:r>
           </w:p>
         </w:tc>
       </w:tr>
@@ -9695,6 +10069,23 @@
                 <w:szCs w:val="28"/>
               </w:rPr>
             </w:pPr>
+            <w:r>
+              <w:rPr>
+                <w:rFonts w:ascii="Times New Roman" w:eastAsia="Times New Roman" w:hAnsi="Times New Roman" w:cs="Times New Roman"/>
+                <w:sz w:val="28"/>
+                <w:szCs w:val="28"/>
+              </w:rPr>
+              <w:t>4</w:t>
+            </w:r>
+            <w:r>
+              <w:rPr>
+                <w:rFonts w:ascii="Times New Roman" w:eastAsia="Times New Roman" w:hAnsi="Times New Roman" w:cs="Times New Roman"/>
+                <w:sz w:val="28"/>
+                <w:szCs w:val="28"/>
+                <w:lang w:val="ru-RU"/>
+              </w:rPr>
+              <w:t>2</w:t>
+            </w:r>
           </w:p>
         </w:tc>
         <w:tc>
@@ -9720,6 +10111,7 @@
         <w:tc>
           <w:tcPr>
             <w:tcW w:w="912" w:type="dxa"/>
+            <w:vAlign w:val="center"/>
           </w:tcPr>
           <w:p>
             <w:pPr>
@@ -9733,6 +10125,9 @@
                 <w:szCs w:val="28"/>
               </w:rPr>
             </w:pPr>
+            <w:r>
+              <w:t>1</w:t>
+            </w:r>
           </w:p>
         </w:tc>
       </w:tr>
@@ -9754,7 +10149,82 @@
                 <w:szCs w:val="28"/>
               </w:rPr>
             </w:pPr>
-            <w:r>
+          </w:p>
+        </w:tc>
+        <w:tc>
+          <w:tcPr>
+            <w:tcW w:w="2733" w:type="dxa"/>
+            <w:vAlign w:val="center"/>
+          </w:tcPr>
+          <w:p>
+            <w:pPr>
+              <w:pStyle w:val="a8"/>
+              <w:ind w:left="0"/>
+            </w:pPr>
+          </w:p>
+        </w:tc>
+        <w:tc>
+          <w:tcPr>
+            <w:tcW w:w="800" w:type="dxa"/>
+          </w:tcPr>
+          <w:p>
+            <w:pPr>
+              <w:pStyle w:val="a8"/>
+              <w:ind w:left="0"/>
+              <w:rPr>
+                <w:rFonts w:ascii="Times New Roman" w:eastAsia="Times New Roman" w:hAnsi="Times New Roman" w:cs="Times New Roman"/>
+                <w:sz w:val="28"/>
+                <w:szCs w:val="28"/>
+                <w:lang w:val="ru-RU"/>
+              </w:rPr>
+            </w:pPr>
+          </w:p>
+        </w:tc>
+        <w:tc>
+          <w:tcPr>
+            <w:tcW w:w="985" w:type="dxa"/>
+          </w:tcPr>
+          <w:p>
+            <w:pPr>
+              <w:pStyle w:val="a8"/>
+              <w:ind w:left="0"/>
+              <w:rPr>
+                <w:rFonts w:ascii="Times New Roman" w:eastAsia="Times New Roman" w:hAnsi="Times New Roman" w:cs="Times New Roman"/>
+                <w:sz w:val="28"/>
+                <w:szCs w:val="28"/>
+              </w:rPr>
+            </w:pPr>
+            <w:r>
+              <w:rPr>
+                <w:rFonts w:ascii="Times New Roman" w:eastAsia="Times New Roman" w:hAnsi="Times New Roman" w:cs="Times New Roman"/>
+                <w:sz w:val="28"/>
+                <w:szCs w:val="28"/>
+              </w:rPr>
+              <w:t>43</w:t>
+            </w:r>
+          </w:p>
+        </w:tc>
+        <w:tc>
+          <w:tcPr>
+            <w:tcW w:w="2556" w:type="dxa"/>
+            <w:vAlign w:val="center"/>
+          </w:tcPr>
+          <w:p>
+            <w:pPr>
+              <w:pStyle w:val="a8"/>
+              <w:ind w:left="0"/>
+            </w:pPr>
+          </w:p>
+        </w:tc>
+        <w:tc>
+          <w:tcPr>
+            <w:tcW w:w="912" w:type="dxa"/>
+            <w:vAlign w:val="center"/>
+          </w:tcPr>
+          <w:p>
+            <w:pPr>
+              <w:pStyle w:val="a8"/>
+              <w:ind w:left="0"/>
               <w:rPr>
                 <w:rFonts w:ascii="Times New Roman" w:eastAsia="Times New Roman" w:hAnsi="Times New Roman" w:cs="Times New Roman"/>
                 <w:b/>
@@ -9762,20 +10232,215 @@
                 <w:sz w:val="28"/>
                 <w:szCs w:val="28"/>
               </w:rPr>
-              <w:t>η</w:t>
-            </w:r>
-            <w:r>
+            </w:pPr>
+            <w:r>
+              <w:t>1</w:t>
+            </w:r>
+          </w:p>
+        </w:tc>
+      </w:tr>
+      <w:tr>
+        <w:trPr>
+          <w:trHeight w:val="95"/>
+        </w:trPr>
+        <w:tc>
+          <w:tcPr>
+            <w:tcW w:w="1359" w:type="dxa"/>
+          </w:tcPr>
+          <w:p>
+            <w:pPr>
+              <w:pStyle w:val="a8"/>
+              <w:ind w:left="0"/>
+              <w:rPr>
+                <w:rFonts w:ascii="Times New Roman" w:eastAsia="Times New Roman" w:hAnsi="Times New Roman" w:cs="Times New Roman"/>
+                <w:sz w:val="28"/>
+                <w:szCs w:val="28"/>
+              </w:rPr>
+            </w:pPr>
+          </w:p>
+        </w:tc>
+        <w:tc>
+          <w:tcPr>
+            <w:tcW w:w="2733" w:type="dxa"/>
+            <w:vAlign w:val="center"/>
+          </w:tcPr>
+          <w:p>
+            <w:pPr>
+              <w:pStyle w:val="a8"/>
+              <w:ind w:left="0"/>
+            </w:pPr>
+          </w:p>
+        </w:tc>
+        <w:tc>
+          <w:tcPr>
+            <w:tcW w:w="800" w:type="dxa"/>
+          </w:tcPr>
+          <w:p>
+            <w:pPr>
+              <w:pStyle w:val="a8"/>
+              <w:ind w:left="0"/>
+              <w:rPr>
+                <w:rFonts w:ascii="Times New Roman" w:eastAsia="Times New Roman" w:hAnsi="Times New Roman" w:cs="Times New Roman"/>
+                <w:sz w:val="28"/>
+                <w:szCs w:val="28"/>
+                <w:lang w:val="ru-RU"/>
+              </w:rPr>
+            </w:pPr>
+          </w:p>
+        </w:tc>
+        <w:tc>
+          <w:tcPr>
+            <w:tcW w:w="985" w:type="dxa"/>
+          </w:tcPr>
+          <w:p>
+            <w:pPr>
+              <w:pStyle w:val="a8"/>
+              <w:ind w:left="0"/>
+              <w:rPr>
+                <w:rFonts w:ascii="Times New Roman" w:eastAsia="Times New Roman" w:hAnsi="Times New Roman" w:cs="Times New Roman"/>
+                <w:sz w:val="28"/>
+                <w:szCs w:val="28"/>
+              </w:rPr>
+            </w:pPr>
+            <w:r>
+              <w:rPr>
+                <w:rFonts w:ascii="Times New Roman" w:eastAsia="Times New Roman" w:hAnsi="Times New Roman" w:cs="Times New Roman"/>
+                <w:sz w:val="28"/>
+                <w:szCs w:val="28"/>
+              </w:rPr>
+              <w:t>44</w:t>
+            </w:r>
+          </w:p>
+        </w:tc>
+        <w:tc>
+          <w:tcPr>
+            <w:tcW w:w="2556" w:type="dxa"/>
+            <w:vAlign w:val="center"/>
+          </w:tcPr>
+          <w:p>
+            <w:pPr>
+              <w:pStyle w:val="a8"/>
+              <w:ind w:left="0"/>
+            </w:pPr>
+          </w:p>
+        </w:tc>
+        <w:tc>
+          <w:tcPr>
+            <w:tcW w:w="912" w:type="dxa"/>
+            <w:vAlign w:val="center"/>
+          </w:tcPr>
+          <w:p>
+            <w:pPr>
+              <w:pStyle w:val="a8"/>
+              <w:ind w:left="0"/>
               <w:rPr>
                 <w:rFonts w:ascii="Times New Roman" w:eastAsia="Times New Roman" w:hAnsi="Times New Roman" w:cs="Times New Roman"/>
                 <w:b/>
                 <w:bCs/>
                 <w:sz w:val="28"/>
                 <w:szCs w:val="28"/>
-                <w:vertAlign w:val="subscript"/>
-              </w:rPr>
-              <w:t>1</w:t>
-            </w:r>
-            <w:r>
+              </w:rPr>
+            </w:pPr>
+            <w:r>
+              <w:t>4</w:t>
+            </w:r>
+          </w:p>
+        </w:tc>
+      </w:tr>
+      <w:tr>
+        <w:trPr>
+          <w:trHeight w:val="95"/>
+        </w:trPr>
+        <w:tc>
+          <w:tcPr>
+            <w:tcW w:w="1359" w:type="dxa"/>
+          </w:tcPr>
+          <w:p>
+            <w:pPr>
+              <w:pStyle w:val="a8"/>
+              <w:ind w:left="0"/>
+              <w:rPr>
+                <w:rFonts w:ascii="Times New Roman" w:eastAsia="Times New Roman" w:hAnsi="Times New Roman" w:cs="Times New Roman"/>
+                <w:sz w:val="28"/>
+                <w:szCs w:val="28"/>
+              </w:rPr>
+            </w:pPr>
+          </w:p>
+        </w:tc>
+        <w:tc>
+          <w:tcPr>
+            <w:tcW w:w="2733" w:type="dxa"/>
+            <w:vAlign w:val="center"/>
+          </w:tcPr>
+          <w:p>
+            <w:pPr>
+              <w:pStyle w:val="a8"/>
+              <w:ind w:left="0"/>
+            </w:pPr>
+          </w:p>
+        </w:tc>
+        <w:tc>
+          <w:tcPr>
+            <w:tcW w:w="800" w:type="dxa"/>
+          </w:tcPr>
+          <w:p>
+            <w:pPr>
+              <w:pStyle w:val="a8"/>
+              <w:ind w:left="0"/>
+              <w:rPr>
+                <w:rFonts w:ascii="Times New Roman" w:eastAsia="Times New Roman" w:hAnsi="Times New Roman" w:cs="Times New Roman"/>
+                <w:sz w:val="28"/>
+                <w:szCs w:val="28"/>
+                <w:lang w:val="ru-RU"/>
+              </w:rPr>
+            </w:pPr>
+          </w:p>
+        </w:tc>
+        <w:tc>
+          <w:tcPr>
+            <w:tcW w:w="985" w:type="dxa"/>
+          </w:tcPr>
+          <w:p>
+            <w:pPr>
+              <w:pStyle w:val="a8"/>
+              <w:ind w:left="0"/>
+              <w:rPr>
+                <w:rFonts w:ascii="Times New Roman" w:eastAsia="Times New Roman" w:hAnsi="Times New Roman" w:cs="Times New Roman"/>
+                <w:sz w:val="28"/>
+                <w:szCs w:val="28"/>
+              </w:rPr>
+            </w:pPr>
+            <w:r>
+              <w:rPr>
+                <w:rFonts w:ascii="Times New Roman" w:eastAsia="Times New Roman" w:hAnsi="Times New Roman" w:cs="Times New Roman"/>
+                <w:sz w:val="28"/>
+                <w:szCs w:val="28"/>
+              </w:rPr>
+              <w:t>45</w:t>
+            </w:r>
+          </w:p>
+        </w:tc>
+        <w:tc>
+          <w:tcPr>
+            <w:tcW w:w="2556" w:type="dxa"/>
+            <w:vAlign w:val="center"/>
+          </w:tcPr>
+          <w:p>
+            <w:pPr>
+              <w:pStyle w:val="a8"/>
+              <w:ind w:left="0"/>
+            </w:pPr>
+          </w:p>
+        </w:tc>
+        <w:tc>
+          <w:tcPr>
+            <w:tcW w:w="912" w:type="dxa"/>
+            <w:vAlign w:val="center"/>
+          </w:tcPr>
+          <w:p>
+            <w:pPr>
+              <w:pStyle w:val="a8"/>
+              <w:ind w:left="0"/>
               <w:rPr>
                 <w:rFonts w:ascii="Times New Roman" w:eastAsia="Times New Roman" w:hAnsi="Times New Roman" w:cs="Times New Roman"/>
                 <w:b/>
@@ -9783,29 +10448,102 @@
                 <w:sz w:val="28"/>
                 <w:szCs w:val="28"/>
               </w:rPr>
-              <w:t xml:space="preserve"> = </w:t>
-            </w:r>
+            </w:pPr>
+            <w:r>
+              <w:t>2</w:t>
+            </w:r>
+          </w:p>
+        </w:tc>
+      </w:tr>
+      <w:tr>
+        <w:trPr>
+          <w:trHeight w:val="95"/>
+        </w:trPr>
+        <w:tc>
+          <w:tcPr>
+            <w:tcW w:w="1359" w:type="dxa"/>
+          </w:tcPr>
+          <w:p>
+            <w:pPr>
+              <w:pStyle w:val="a8"/>
+              <w:ind w:left="0"/>
+              <w:rPr>
+                <w:rFonts w:ascii="Times New Roman" w:eastAsia="Times New Roman" w:hAnsi="Times New Roman" w:cs="Times New Roman"/>
+                <w:sz w:val="28"/>
+                <w:szCs w:val="28"/>
+              </w:rPr>
+            </w:pPr>
           </w:p>
         </w:tc>
         <w:tc>
           <w:tcPr>
             <w:tcW w:w="2733" w:type="dxa"/>
-          </w:tcPr>
-          <w:p>
-            <w:pPr>
-              <w:pStyle w:val="a8"/>
-              <w:ind w:left="0"/>
-              <w:rPr>
-                <w:rFonts w:ascii="Times New Roman" w:eastAsia="Times New Roman" w:hAnsi="Times New Roman" w:cs="Times New Roman"/>
-                <w:sz w:val="28"/>
-                <w:szCs w:val="28"/>
-              </w:rPr>
+            <w:vAlign w:val="center"/>
+          </w:tcPr>
+          <w:p>
+            <w:pPr>
+              <w:pStyle w:val="a8"/>
+              <w:ind w:left="0"/>
             </w:pPr>
           </w:p>
         </w:tc>
         <w:tc>
           <w:tcPr>
             <w:tcW w:w="800" w:type="dxa"/>
+          </w:tcPr>
+          <w:p>
+            <w:pPr>
+              <w:pStyle w:val="a8"/>
+              <w:ind w:left="0"/>
+              <w:rPr>
+                <w:rFonts w:ascii="Times New Roman" w:eastAsia="Times New Roman" w:hAnsi="Times New Roman" w:cs="Times New Roman"/>
+                <w:sz w:val="28"/>
+                <w:szCs w:val="28"/>
+                <w:lang w:val="ru-RU"/>
+              </w:rPr>
+            </w:pPr>
+          </w:p>
+        </w:tc>
+        <w:tc>
+          <w:tcPr>
+            <w:tcW w:w="985" w:type="dxa"/>
+          </w:tcPr>
+          <w:p>
+            <w:pPr>
+              <w:pStyle w:val="a8"/>
+              <w:ind w:left="0"/>
+              <w:rPr>
+                <w:rFonts w:ascii="Times New Roman" w:eastAsia="Times New Roman" w:hAnsi="Times New Roman" w:cs="Times New Roman"/>
+                <w:sz w:val="28"/>
+                <w:szCs w:val="28"/>
+              </w:rPr>
+            </w:pPr>
+            <w:r>
+              <w:rPr>
+                <w:rFonts w:ascii="Times New Roman" w:eastAsia="Times New Roman" w:hAnsi="Times New Roman" w:cs="Times New Roman"/>
+                <w:sz w:val="28"/>
+                <w:szCs w:val="28"/>
+              </w:rPr>
+              <w:t>46</w:t>
+            </w:r>
+          </w:p>
+        </w:tc>
+        <w:tc>
+          <w:tcPr>
+            <w:tcW w:w="2556" w:type="dxa"/>
+            <w:vAlign w:val="center"/>
+          </w:tcPr>
+          <w:p>
+            <w:pPr>
+              <w:pStyle w:val="a8"/>
+              <w:ind w:left="0"/>
+            </w:pPr>
+          </w:p>
+        </w:tc>
+        <w:tc>
+          <w:tcPr>
+            <w:tcW w:w="912" w:type="dxa"/>
+            <w:vAlign w:val="center"/>
           </w:tcPr>
           <w:p>
             <w:pPr>
@@ -9820,6 +10558,105 @@
               </w:rPr>
             </w:pPr>
             <w:r>
+              <w:t>4</w:t>
+            </w:r>
+          </w:p>
+        </w:tc>
+      </w:tr>
+      <w:tr>
+        <w:trPr>
+          <w:trHeight w:val="95"/>
+        </w:trPr>
+        <w:tc>
+          <w:tcPr>
+            <w:tcW w:w="1359" w:type="dxa"/>
+          </w:tcPr>
+          <w:p>
+            <w:pPr>
+              <w:pStyle w:val="a8"/>
+              <w:ind w:left="0"/>
+              <w:rPr>
+                <w:rFonts w:ascii="Times New Roman" w:eastAsia="Times New Roman" w:hAnsi="Times New Roman" w:cs="Times New Roman"/>
+                <w:sz w:val="28"/>
+                <w:szCs w:val="28"/>
+              </w:rPr>
+            </w:pPr>
+          </w:p>
+        </w:tc>
+        <w:tc>
+          <w:tcPr>
+            <w:tcW w:w="2733" w:type="dxa"/>
+            <w:vAlign w:val="center"/>
+          </w:tcPr>
+          <w:p>
+            <w:pPr>
+              <w:pStyle w:val="a8"/>
+              <w:ind w:left="0"/>
+            </w:pPr>
+          </w:p>
+        </w:tc>
+        <w:tc>
+          <w:tcPr>
+            <w:tcW w:w="800" w:type="dxa"/>
+          </w:tcPr>
+          <w:p>
+            <w:pPr>
+              <w:pStyle w:val="a8"/>
+              <w:ind w:left="0"/>
+              <w:rPr>
+                <w:rFonts w:ascii="Times New Roman" w:eastAsia="Times New Roman" w:hAnsi="Times New Roman" w:cs="Times New Roman"/>
+                <w:sz w:val="28"/>
+                <w:szCs w:val="28"/>
+                <w:lang w:val="ru-RU"/>
+              </w:rPr>
+            </w:pPr>
+          </w:p>
+        </w:tc>
+        <w:tc>
+          <w:tcPr>
+            <w:tcW w:w="985" w:type="dxa"/>
+          </w:tcPr>
+          <w:p>
+            <w:pPr>
+              <w:pStyle w:val="a8"/>
+              <w:ind w:left="0"/>
+              <w:rPr>
+                <w:rFonts w:ascii="Times New Roman" w:eastAsia="Times New Roman" w:hAnsi="Times New Roman" w:cs="Times New Roman"/>
+                <w:sz w:val="28"/>
+                <w:szCs w:val="28"/>
+              </w:rPr>
+            </w:pPr>
+            <w:r>
+              <w:rPr>
+                <w:rFonts w:ascii="Times New Roman" w:eastAsia="Times New Roman" w:hAnsi="Times New Roman" w:cs="Times New Roman"/>
+                <w:sz w:val="28"/>
+                <w:szCs w:val="28"/>
+              </w:rPr>
+              <w:t>47</w:t>
+            </w:r>
+          </w:p>
+        </w:tc>
+        <w:tc>
+          <w:tcPr>
+            <w:tcW w:w="2556" w:type="dxa"/>
+            <w:vAlign w:val="center"/>
+          </w:tcPr>
+          <w:p>
+            <w:pPr>
+              <w:pStyle w:val="a8"/>
+              <w:ind w:left="0"/>
+            </w:pPr>
+          </w:p>
+        </w:tc>
+        <w:tc>
+          <w:tcPr>
+            <w:tcW w:w="912" w:type="dxa"/>
+            <w:vAlign w:val="center"/>
+          </w:tcPr>
+          <w:p>
+            <w:pPr>
+              <w:pStyle w:val="a8"/>
+              <w:ind w:left="0"/>
               <w:rPr>
                 <w:rFonts w:ascii="Times New Roman" w:eastAsia="Times New Roman" w:hAnsi="Times New Roman" w:cs="Times New Roman"/>
                 <w:b/>
@@ -9827,20 +10664,215 @@
                 <w:sz w:val="28"/>
                 <w:szCs w:val="28"/>
               </w:rPr>
-              <w:t>N</w:t>
-            </w:r>
-            <w:r>
+            </w:pPr>
+            <w:r>
+              <w:t>2</w:t>
+            </w:r>
+          </w:p>
+        </w:tc>
+      </w:tr>
+      <w:tr>
+        <w:trPr>
+          <w:trHeight w:val="95"/>
+        </w:trPr>
+        <w:tc>
+          <w:tcPr>
+            <w:tcW w:w="1359" w:type="dxa"/>
+          </w:tcPr>
+          <w:p>
+            <w:pPr>
+              <w:pStyle w:val="a8"/>
+              <w:ind w:left="0"/>
+              <w:rPr>
+                <w:rFonts w:ascii="Times New Roman" w:eastAsia="Times New Roman" w:hAnsi="Times New Roman" w:cs="Times New Roman"/>
+                <w:sz w:val="28"/>
+                <w:szCs w:val="28"/>
+              </w:rPr>
+            </w:pPr>
+          </w:p>
+        </w:tc>
+        <w:tc>
+          <w:tcPr>
+            <w:tcW w:w="2733" w:type="dxa"/>
+            <w:vAlign w:val="center"/>
+          </w:tcPr>
+          <w:p>
+            <w:pPr>
+              <w:pStyle w:val="a8"/>
+              <w:ind w:left="0"/>
+            </w:pPr>
+          </w:p>
+        </w:tc>
+        <w:tc>
+          <w:tcPr>
+            <w:tcW w:w="800" w:type="dxa"/>
+          </w:tcPr>
+          <w:p>
+            <w:pPr>
+              <w:pStyle w:val="a8"/>
+              <w:ind w:left="0"/>
+              <w:rPr>
+                <w:rFonts w:ascii="Times New Roman" w:eastAsia="Times New Roman" w:hAnsi="Times New Roman" w:cs="Times New Roman"/>
+                <w:sz w:val="28"/>
+                <w:szCs w:val="28"/>
+                <w:lang w:val="ru-RU"/>
+              </w:rPr>
+            </w:pPr>
+          </w:p>
+        </w:tc>
+        <w:tc>
+          <w:tcPr>
+            <w:tcW w:w="985" w:type="dxa"/>
+          </w:tcPr>
+          <w:p>
+            <w:pPr>
+              <w:pStyle w:val="a8"/>
+              <w:ind w:left="0"/>
+              <w:rPr>
+                <w:rFonts w:ascii="Times New Roman" w:eastAsia="Times New Roman" w:hAnsi="Times New Roman" w:cs="Times New Roman"/>
+                <w:sz w:val="28"/>
+                <w:szCs w:val="28"/>
+              </w:rPr>
+            </w:pPr>
+            <w:r>
+              <w:rPr>
+                <w:rFonts w:ascii="Times New Roman" w:eastAsia="Times New Roman" w:hAnsi="Times New Roman" w:cs="Times New Roman"/>
+                <w:sz w:val="28"/>
+                <w:szCs w:val="28"/>
+              </w:rPr>
+              <w:t>48</w:t>
+            </w:r>
+          </w:p>
+        </w:tc>
+        <w:tc>
+          <w:tcPr>
+            <w:tcW w:w="2556" w:type="dxa"/>
+            <w:vAlign w:val="center"/>
+          </w:tcPr>
+          <w:p>
+            <w:pPr>
+              <w:pStyle w:val="a8"/>
+              <w:ind w:left="0"/>
+            </w:pPr>
+          </w:p>
+        </w:tc>
+        <w:tc>
+          <w:tcPr>
+            <w:tcW w:w="912" w:type="dxa"/>
+            <w:vAlign w:val="center"/>
+          </w:tcPr>
+          <w:p>
+            <w:pPr>
+              <w:pStyle w:val="a8"/>
+              <w:ind w:left="0"/>
               <w:rPr>
                 <w:rFonts w:ascii="Times New Roman" w:eastAsia="Times New Roman" w:hAnsi="Times New Roman" w:cs="Times New Roman"/>
                 <w:b/>
                 <w:bCs/>
                 <w:sz w:val="28"/>
                 <w:szCs w:val="28"/>
-                <w:vertAlign w:val="subscript"/>
-              </w:rPr>
-              <w:t>1</w:t>
-            </w:r>
-            <w:r>
+              </w:rPr>
+            </w:pPr>
+            <w:r>
+              <w:t>4</w:t>
+            </w:r>
+          </w:p>
+        </w:tc>
+      </w:tr>
+      <w:tr>
+        <w:trPr>
+          <w:trHeight w:val="95"/>
+        </w:trPr>
+        <w:tc>
+          <w:tcPr>
+            <w:tcW w:w="1359" w:type="dxa"/>
+          </w:tcPr>
+          <w:p>
+            <w:pPr>
+              <w:pStyle w:val="a8"/>
+              <w:ind w:left="0"/>
+              <w:rPr>
+                <w:rFonts w:ascii="Times New Roman" w:eastAsia="Times New Roman" w:hAnsi="Times New Roman" w:cs="Times New Roman"/>
+                <w:sz w:val="28"/>
+                <w:szCs w:val="28"/>
+              </w:rPr>
+            </w:pPr>
+          </w:p>
+        </w:tc>
+        <w:tc>
+          <w:tcPr>
+            <w:tcW w:w="2733" w:type="dxa"/>
+            <w:vAlign w:val="center"/>
+          </w:tcPr>
+          <w:p>
+            <w:pPr>
+              <w:pStyle w:val="a8"/>
+              <w:ind w:left="0"/>
+            </w:pPr>
+          </w:p>
+        </w:tc>
+        <w:tc>
+          <w:tcPr>
+            <w:tcW w:w="800" w:type="dxa"/>
+          </w:tcPr>
+          <w:p>
+            <w:pPr>
+              <w:pStyle w:val="a8"/>
+              <w:ind w:left="0"/>
+              <w:rPr>
+                <w:rFonts w:ascii="Times New Roman" w:eastAsia="Times New Roman" w:hAnsi="Times New Roman" w:cs="Times New Roman"/>
+                <w:sz w:val="28"/>
+                <w:szCs w:val="28"/>
+                <w:lang w:val="ru-RU"/>
+              </w:rPr>
+            </w:pPr>
+          </w:p>
+        </w:tc>
+        <w:tc>
+          <w:tcPr>
+            <w:tcW w:w="985" w:type="dxa"/>
+          </w:tcPr>
+          <w:p>
+            <w:pPr>
+              <w:pStyle w:val="a8"/>
+              <w:ind w:left="0"/>
+              <w:rPr>
+                <w:rFonts w:ascii="Times New Roman" w:eastAsia="Times New Roman" w:hAnsi="Times New Roman" w:cs="Times New Roman"/>
+                <w:sz w:val="28"/>
+                <w:szCs w:val="28"/>
+              </w:rPr>
+            </w:pPr>
+            <w:r>
+              <w:rPr>
+                <w:rFonts w:ascii="Times New Roman" w:eastAsia="Times New Roman" w:hAnsi="Times New Roman" w:cs="Times New Roman"/>
+                <w:sz w:val="28"/>
+                <w:szCs w:val="28"/>
+              </w:rPr>
+              <w:t>49</w:t>
+            </w:r>
+          </w:p>
+        </w:tc>
+        <w:tc>
+          <w:tcPr>
+            <w:tcW w:w="2556" w:type="dxa"/>
+            <w:vAlign w:val="center"/>
+          </w:tcPr>
+          <w:p>
+            <w:pPr>
+              <w:pStyle w:val="a8"/>
+              <w:ind w:left="0"/>
+            </w:pPr>
+          </w:p>
+        </w:tc>
+        <w:tc>
+          <w:tcPr>
+            <w:tcW w:w="912" w:type="dxa"/>
+            <w:vAlign w:val="center"/>
+          </w:tcPr>
+          <w:p>
+            <w:pPr>
+              <w:pStyle w:val="a8"/>
+              <w:ind w:left="0"/>
               <w:rPr>
                 <w:rFonts w:ascii="Times New Roman" w:eastAsia="Times New Roman" w:hAnsi="Times New Roman" w:cs="Times New Roman"/>
                 <w:b/>
@@ -9848,13 +10880,102 @@
                 <w:sz w:val="28"/>
                 <w:szCs w:val="28"/>
               </w:rPr>
-              <w:t xml:space="preserve"> = </w:t>
-            </w:r>
+            </w:pPr>
+            <w:r>
+              <w:t>1</w:t>
+            </w:r>
+          </w:p>
+        </w:tc>
+      </w:tr>
+      <w:tr>
+        <w:trPr>
+          <w:trHeight w:val="95"/>
+        </w:trPr>
+        <w:tc>
+          <w:tcPr>
+            <w:tcW w:w="1359" w:type="dxa"/>
+          </w:tcPr>
+          <w:p>
+            <w:pPr>
+              <w:pStyle w:val="a8"/>
+              <w:ind w:left="0"/>
+              <w:rPr>
+                <w:rFonts w:ascii="Times New Roman" w:eastAsia="Times New Roman" w:hAnsi="Times New Roman" w:cs="Times New Roman"/>
+                <w:sz w:val="28"/>
+                <w:szCs w:val="28"/>
+              </w:rPr>
+            </w:pPr>
+          </w:p>
+        </w:tc>
+        <w:tc>
+          <w:tcPr>
+            <w:tcW w:w="2733" w:type="dxa"/>
+            <w:vAlign w:val="center"/>
+          </w:tcPr>
+          <w:p>
+            <w:pPr>
+              <w:pStyle w:val="a8"/>
+              <w:ind w:left="0"/>
+            </w:pPr>
+          </w:p>
+        </w:tc>
+        <w:tc>
+          <w:tcPr>
+            <w:tcW w:w="800" w:type="dxa"/>
+          </w:tcPr>
+          <w:p>
+            <w:pPr>
+              <w:pStyle w:val="a8"/>
+              <w:ind w:left="0"/>
+              <w:rPr>
+                <w:rFonts w:ascii="Times New Roman" w:eastAsia="Times New Roman" w:hAnsi="Times New Roman" w:cs="Times New Roman"/>
+                <w:sz w:val="28"/>
+                <w:szCs w:val="28"/>
+                <w:lang w:val="ru-RU"/>
+              </w:rPr>
+            </w:pPr>
           </w:p>
         </w:tc>
         <w:tc>
           <w:tcPr>
             <w:tcW w:w="985" w:type="dxa"/>
+          </w:tcPr>
+          <w:p>
+            <w:pPr>
+              <w:pStyle w:val="a8"/>
+              <w:ind w:left="0"/>
+              <w:rPr>
+                <w:rFonts w:ascii="Times New Roman" w:eastAsia="Times New Roman" w:hAnsi="Times New Roman" w:cs="Times New Roman"/>
+                <w:sz w:val="28"/>
+                <w:szCs w:val="28"/>
+              </w:rPr>
+            </w:pPr>
+            <w:r>
+              <w:rPr>
+                <w:rFonts w:ascii="Times New Roman" w:eastAsia="Times New Roman" w:hAnsi="Times New Roman" w:cs="Times New Roman"/>
+                <w:sz w:val="28"/>
+                <w:szCs w:val="28"/>
+              </w:rPr>
+              <w:t>50</w:t>
+            </w:r>
+          </w:p>
+        </w:tc>
+        <w:tc>
+          <w:tcPr>
+            <w:tcW w:w="2556" w:type="dxa"/>
+            <w:vAlign w:val="center"/>
+          </w:tcPr>
+          <w:p>
+            <w:pPr>
+              <w:pStyle w:val="a8"/>
+              <w:ind w:left="0"/>
+            </w:pPr>
+          </w:p>
+        </w:tc>
+        <w:tc>
+          <w:tcPr>
+            <w:tcW w:w="912" w:type="dxa"/>
+            <w:vAlign w:val="center"/>
           </w:tcPr>
           <w:p>
             <w:pPr>
@@ -9869,6 +10990,105 @@
               </w:rPr>
             </w:pPr>
             <w:r>
+              <w:t>2</w:t>
+            </w:r>
+          </w:p>
+        </w:tc>
+      </w:tr>
+      <w:tr>
+        <w:trPr>
+          <w:trHeight w:val="95"/>
+        </w:trPr>
+        <w:tc>
+          <w:tcPr>
+            <w:tcW w:w="1359" w:type="dxa"/>
+          </w:tcPr>
+          <w:p>
+            <w:pPr>
+              <w:pStyle w:val="a8"/>
+              <w:ind w:left="0"/>
+              <w:rPr>
+                <w:rFonts w:ascii="Times New Roman" w:eastAsia="Times New Roman" w:hAnsi="Times New Roman" w:cs="Times New Roman"/>
+                <w:sz w:val="28"/>
+                <w:szCs w:val="28"/>
+              </w:rPr>
+            </w:pPr>
+          </w:p>
+        </w:tc>
+        <w:tc>
+          <w:tcPr>
+            <w:tcW w:w="2733" w:type="dxa"/>
+            <w:vAlign w:val="center"/>
+          </w:tcPr>
+          <w:p>
+            <w:pPr>
+              <w:pStyle w:val="a8"/>
+              <w:ind w:left="0"/>
+            </w:pPr>
+          </w:p>
+        </w:tc>
+        <w:tc>
+          <w:tcPr>
+            <w:tcW w:w="800" w:type="dxa"/>
+          </w:tcPr>
+          <w:p>
+            <w:pPr>
+              <w:pStyle w:val="a8"/>
+              <w:ind w:left="0"/>
+              <w:rPr>
+                <w:rFonts w:ascii="Times New Roman" w:eastAsia="Times New Roman" w:hAnsi="Times New Roman" w:cs="Times New Roman"/>
+                <w:sz w:val="28"/>
+                <w:szCs w:val="28"/>
+                <w:lang w:val="ru-RU"/>
+              </w:rPr>
+            </w:pPr>
+          </w:p>
+        </w:tc>
+        <w:tc>
+          <w:tcPr>
+            <w:tcW w:w="985" w:type="dxa"/>
+          </w:tcPr>
+          <w:p>
+            <w:pPr>
+              <w:pStyle w:val="a8"/>
+              <w:ind w:left="0"/>
+              <w:rPr>
+                <w:rFonts w:ascii="Times New Roman" w:eastAsia="Times New Roman" w:hAnsi="Times New Roman" w:cs="Times New Roman"/>
+                <w:sz w:val="28"/>
+                <w:szCs w:val="28"/>
+              </w:rPr>
+            </w:pPr>
+            <w:r>
+              <w:rPr>
+                <w:rFonts w:ascii="Times New Roman" w:eastAsia="Times New Roman" w:hAnsi="Times New Roman" w:cs="Times New Roman"/>
+                <w:sz w:val="28"/>
+                <w:szCs w:val="28"/>
+              </w:rPr>
+              <w:t>51</w:t>
+            </w:r>
+          </w:p>
+        </w:tc>
+        <w:tc>
+          <w:tcPr>
+            <w:tcW w:w="2556" w:type="dxa"/>
+            <w:vAlign w:val="center"/>
+          </w:tcPr>
+          <w:p>
+            <w:pPr>
+              <w:pStyle w:val="a8"/>
+              <w:ind w:left="0"/>
+            </w:pPr>
+          </w:p>
+        </w:tc>
+        <w:tc>
+          <w:tcPr>
+            <w:tcW w:w="912" w:type="dxa"/>
+            <w:vAlign w:val="center"/>
+          </w:tcPr>
+          <w:p>
+            <w:pPr>
+              <w:pStyle w:val="a8"/>
+              <w:ind w:left="0"/>
               <w:rPr>
                 <w:rFonts w:ascii="Times New Roman" w:eastAsia="Times New Roman" w:hAnsi="Times New Roman" w:cs="Times New Roman"/>
                 <w:b/>
@@ -9876,20 +11096,215 @@
                 <w:sz w:val="28"/>
                 <w:szCs w:val="28"/>
               </w:rPr>
-              <w:t>η</w:t>
-            </w:r>
-            <w:r>
+            </w:pPr>
+            <w:r>
+              <w:t>1</w:t>
+            </w:r>
+          </w:p>
+        </w:tc>
+      </w:tr>
+      <w:tr>
+        <w:trPr>
+          <w:trHeight w:val="95"/>
+        </w:trPr>
+        <w:tc>
+          <w:tcPr>
+            <w:tcW w:w="1359" w:type="dxa"/>
+          </w:tcPr>
+          <w:p>
+            <w:pPr>
+              <w:pStyle w:val="a8"/>
+              <w:ind w:left="0"/>
+              <w:rPr>
+                <w:rFonts w:ascii="Times New Roman" w:eastAsia="Times New Roman" w:hAnsi="Times New Roman" w:cs="Times New Roman"/>
+                <w:sz w:val="28"/>
+                <w:szCs w:val="28"/>
+              </w:rPr>
+            </w:pPr>
+          </w:p>
+        </w:tc>
+        <w:tc>
+          <w:tcPr>
+            <w:tcW w:w="2733" w:type="dxa"/>
+            <w:vAlign w:val="center"/>
+          </w:tcPr>
+          <w:p>
+            <w:pPr>
+              <w:pStyle w:val="a8"/>
+              <w:ind w:left="0"/>
+            </w:pPr>
+          </w:p>
+        </w:tc>
+        <w:tc>
+          <w:tcPr>
+            <w:tcW w:w="800" w:type="dxa"/>
+          </w:tcPr>
+          <w:p>
+            <w:pPr>
+              <w:pStyle w:val="a8"/>
+              <w:ind w:left="0"/>
+              <w:rPr>
+                <w:rFonts w:ascii="Times New Roman" w:eastAsia="Times New Roman" w:hAnsi="Times New Roman" w:cs="Times New Roman"/>
+                <w:sz w:val="28"/>
+                <w:szCs w:val="28"/>
+                <w:lang w:val="ru-RU"/>
+              </w:rPr>
+            </w:pPr>
+          </w:p>
+        </w:tc>
+        <w:tc>
+          <w:tcPr>
+            <w:tcW w:w="985" w:type="dxa"/>
+          </w:tcPr>
+          <w:p>
+            <w:pPr>
+              <w:pStyle w:val="a8"/>
+              <w:ind w:left="0"/>
+              <w:rPr>
+                <w:rFonts w:ascii="Times New Roman" w:eastAsia="Times New Roman" w:hAnsi="Times New Roman" w:cs="Times New Roman"/>
+                <w:sz w:val="28"/>
+                <w:szCs w:val="28"/>
+              </w:rPr>
+            </w:pPr>
+            <w:r>
+              <w:rPr>
+                <w:rFonts w:ascii="Times New Roman" w:eastAsia="Times New Roman" w:hAnsi="Times New Roman" w:cs="Times New Roman"/>
+                <w:sz w:val="28"/>
+                <w:szCs w:val="28"/>
+              </w:rPr>
+              <w:t>52</w:t>
+            </w:r>
+          </w:p>
+        </w:tc>
+        <w:tc>
+          <w:tcPr>
+            <w:tcW w:w="2556" w:type="dxa"/>
+            <w:vAlign w:val="center"/>
+          </w:tcPr>
+          <w:p>
+            <w:pPr>
+              <w:pStyle w:val="a8"/>
+              <w:ind w:left="0"/>
+            </w:pPr>
+          </w:p>
+        </w:tc>
+        <w:tc>
+          <w:tcPr>
+            <w:tcW w:w="912" w:type="dxa"/>
+            <w:vAlign w:val="center"/>
+          </w:tcPr>
+          <w:p>
+            <w:pPr>
+              <w:pStyle w:val="a8"/>
+              <w:ind w:left="0"/>
               <w:rPr>
                 <w:rFonts w:ascii="Times New Roman" w:eastAsia="Times New Roman" w:hAnsi="Times New Roman" w:cs="Times New Roman"/>
                 <w:b/>
                 <w:bCs/>
                 <w:sz w:val="28"/>
                 <w:szCs w:val="28"/>
-                <w:vertAlign w:val="subscript"/>
-              </w:rPr>
-              <w:t>2</w:t>
-            </w:r>
-            <w:r>
+              </w:rPr>
+            </w:pPr>
+            <w:r>
+              <w:t>1</w:t>
+            </w:r>
+          </w:p>
+        </w:tc>
+      </w:tr>
+      <w:tr>
+        <w:trPr>
+          <w:trHeight w:val="95"/>
+        </w:trPr>
+        <w:tc>
+          <w:tcPr>
+            <w:tcW w:w="1359" w:type="dxa"/>
+          </w:tcPr>
+          <w:p>
+            <w:pPr>
+              <w:pStyle w:val="a8"/>
+              <w:ind w:left="0"/>
+              <w:rPr>
+                <w:rFonts w:ascii="Times New Roman" w:eastAsia="Times New Roman" w:hAnsi="Times New Roman" w:cs="Times New Roman"/>
+                <w:sz w:val="28"/>
+                <w:szCs w:val="28"/>
+              </w:rPr>
+            </w:pPr>
+          </w:p>
+        </w:tc>
+        <w:tc>
+          <w:tcPr>
+            <w:tcW w:w="2733" w:type="dxa"/>
+            <w:vAlign w:val="center"/>
+          </w:tcPr>
+          <w:p>
+            <w:pPr>
+              <w:pStyle w:val="a8"/>
+              <w:ind w:left="0"/>
+            </w:pPr>
+          </w:p>
+        </w:tc>
+        <w:tc>
+          <w:tcPr>
+            <w:tcW w:w="800" w:type="dxa"/>
+          </w:tcPr>
+          <w:p>
+            <w:pPr>
+              <w:pStyle w:val="a8"/>
+              <w:ind w:left="0"/>
+              <w:rPr>
+                <w:rFonts w:ascii="Times New Roman" w:eastAsia="Times New Roman" w:hAnsi="Times New Roman" w:cs="Times New Roman"/>
+                <w:sz w:val="28"/>
+                <w:szCs w:val="28"/>
+                <w:lang w:val="ru-RU"/>
+              </w:rPr>
+            </w:pPr>
+          </w:p>
+        </w:tc>
+        <w:tc>
+          <w:tcPr>
+            <w:tcW w:w="985" w:type="dxa"/>
+          </w:tcPr>
+          <w:p>
+            <w:pPr>
+              <w:pStyle w:val="a8"/>
+              <w:ind w:left="0"/>
+              <w:rPr>
+                <w:rFonts w:ascii="Times New Roman" w:eastAsia="Times New Roman" w:hAnsi="Times New Roman" w:cs="Times New Roman"/>
+                <w:sz w:val="28"/>
+                <w:szCs w:val="28"/>
+              </w:rPr>
+            </w:pPr>
+            <w:r>
+              <w:rPr>
+                <w:rFonts w:ascii="Times New Roman" w:eastAsia="Times New Roman" w:hAnsi="Times New Roman" w:cs="Times New Roman"/>
+                <w:sz w:val="28"/>
+                <w:szCs w:val="28"/>
+              </w:rPr>
+              <w:t>53</w:t>
+            </w:r>
+          </w:p>
+        </w:tc>
+        <w:tc>
+          <w:tcPr>
+            <w:tcW w:w="2556" w:type="dxa"/>
+            <w:vAlign w:val="center"/>
+          </w:tcPr>
+          <w:p>
+            <w:pPr>
+              <w:pStyle w:val="a8"/>
+              <w:ind w:left="0"/>
+            </w:pPr>
+          </w:p>
+        </w:tc>
+        <w:tc>
+          <w:tcPr>
+            <w:tcW w:w="912" w:type="dxa"/>
+            <w:vAlign w:val="center"/>
+          </w:tcPr>
+          <w:p>
+            <w:pPr>
+              <w:pStyle w:val="a8"/>
+              <w:ind w:left="0"/>
               <w:rPr>
                 <w:rFonts w:ascii="Times New Roman" w:eastAsia="Times New Roman" w:hAnsi="Times New Roman" w:cs="Times New Roman"/>
                 <w:b/>
@@ -9897,29 +11312,102 @@
                 <w:sz w:val="28"/>
                 <w:szCs w:val="28"/>
               </w:rPr>
-              <w:t xml:space="preserve"> = </w:t>
+            </w:pPr>
+            <w:r>
+              <w:t>1</w:t>
+            </w:r>
+          </w:p>
+        </w:tc>
+      </w:tr>
+      <w:tr>
+        <w:trPr>
+          <w:trHeight w:val="95"/>
+        </w:trPr>
+        <w:tc>
+          <w:tcPr>
+            <w:tcW w:w="1359" w:type="dxa"/>
+          </w:tcPr>
+          <w:p>
+            <w:pPr>
+              <w:pStyle w:val="a8"/>
+              <w:ind w:left="0"/>
+              <w:rPr>
+                <w:rFonts w:ascii="Times New Roman" w:eastAsia="Times New Roman" w:hAnsi="Times New Roman" w:cs="Times New Roman"/>
+                <w:sz w:val="28"/>
+                <w:szCs w:val="28"/>
+              </w:rPr>
+            </w:pPr>
+          </w:p>
+        </w:tc>
+        <w:tc>
+          <w:tcPr>
+            <w:tcW w:w="2733" w:type="dxa"/>
+            <w:vAlign w:val="center"/>
+          </w:tcPr>
+          <w:p>
+            <w:pPr>
+              <w:pStyle w:val="a8"/>
+              <w:ind w:left="0"/>
+            </w:pPr>
+          </w:p>
+        </w:tc>
+        <w:tc>
+          <w:tcPr>
+            <w:tcW w:w="800" w:type="dxa"/>
+          </w:tcPr>
+          <w:p>
+            <w:pPr>
+              <w:pStyle w:val="a8"/>
+              <w:ind w:left="0"/>
+              <w:rPr>
+                <w:rFonts w:ascii="Times New Roman" w:eastAsia="Times New Roman" w:hAnsi="Times New Roman" w:cs="Times New Roman"/>
+                <w:sz w:val="28"/>
+                <w:szCs w:val="28"/>
+                <w:lang w:val="ru-RU"/>
+              </w:rPr>
+            </w:pPr>
+          </w:p>
+        </w:tc>
+        <w:tc>
+          <w:tcPr>
+            <w:tcW w:w="985" w:type="dxa"/>
+          </w:tcPr>
+          <w:p>
+            <w:pPr>
+              <w:pStyle w:val="a8"/>
+              <w:ind w:left="0"/>
+              <w:rPr>
+                <w:rFonts w:ascii="Times New Roman" w:eastAsia="Times New Roman" w:hAnsi="Times New Roman" w:cs="Times New Roman"/>
+                <w:sz w:val="28"/>
+                <w:szCs w:val="28"/>
+              </w:rPr>
+            </w:pPr>
+            <w:r>
+              <w:rPr>
+                <w:rFonts w:ascii="Times New Roman" w:eastAsia="Times New Roman" w:hAnsi="Times New Roman" w:cs="Times New Roman"/>
+                <w:sz w:val="28"/>
+                <w:szCs w:val="28"/>
+              </w:rPr>
+              <w:t>54</w:t>
             </w:r>
           </w:p>
         </w:tc>
         <w:tc>
           <w:tcPr>
             <w:tcW w:w="2556" w:type="dxa"/>
-          </w:tcPr>
-          <w:p>
-            <w:pPr>
-              <w:pStyle w:val="a8"/>
-              <w:ind w:left="0"/>
-              <w:rPr>
-                <w:rFonts w:ascii="Times New Roman" w:eastAsia="Times New Roman" w:hAnsi="Times New Roman" w:cs="Times New Roman"/>
-                <w:sz w:val="28"/>
-                <w:szCs w:val="28"/>
-              </w:rPr>
+            <w:vAlign w:val="center"/>
+          </w:tcPr>
+          <w:p>
+            <w:pPr>
+              <w:pStyle w:val="a8"/>
+              <w:ind w:left="0"/>
             </w:pPr>
           </w:p>
         </w:tc>
         <w:tc>
           <w:tcPr>
             <w:tcW w:w="912" w:type="dxa"/>
+            <w:vAlign w:val="center"/>
           </w:tcPr>
           <w:p>
             <w:pPr>
@@ -9934,6 +11422,105 @@
               </w:rPr>
             </w:pPr>
             <w:r>
+              <w:t>1</w:t>
+            </w:r>
+          </w:p>
+        </w:tc>
+      </w:tr>
+      <w:tr>
+        <w:trPr>
+          <w:trHeight w:val="95"/>
+        </w:trPr>
+        <w:tc>
+          <w:tcPr>
+            <w:tcW w:w="1359" w:type="dxa"/>
+          </w:tcPr>
+          <w:p>
+            <w:pPr>
+              <w:pStyle w:val="a8"/>
+              <w:ind w:left="0"/>
+              <w:rPr>
+                <w:rFonts w:ascii="Times New Roman" w:eastAsia="Times New Roman" w:hAnsi="Times New Roman" w:cs="Times New Roman"/>
+                <w:sz w:val="28"/>
+                <w:szCs w:val="28"/>
+              </w:rPr>
+            </w:pPr>
+          </w:p>
+        </w:tc>
+        <w:tc>
+          <w:tcPr>
+            <w:tcW w:w="2733" w:type="dxa"/>
+            <w:vAlign w:val="center"/>
+          </w:tcPr>
+          <w:p>
+            <w:pPr>
+              <w:pStyle w:val="a8"/>
+              <w:ind w:left="0"/>
+            </w:pPr>
+          </w:p>
+        </w:tc>
+        <w:tc>
+          <w:tcPr>
+            <w:tcW w:w="800" w:type="dxa"/>
+          </w:tcPr>
+          <w:p>
+            <w:pPr>
+              <w:pStyle w:val="a8"/>
+              <w:ind w:left="0"/>
+              <w:rPr>
+                <w:rFonts w:ascii="Times New Roman" w:eastAsia="Times New Roman" w:hAnsi="Times New Roman" w:cs="Times New Roman"/>
+                <w:sz w:val="28"/>
+                <w:szCs w:val="28"/>
+                <w:lang w:val="ru-RU"/>
+              </w:rPr>
+            </w:pPr>
+          </w:p>
+        </w:tc>
+        <w:tc>
+          <w:tcPr>
+            <w:tcW w:w="985" w:type="dxa"/>
+          </w:tcPr>
+          <w:p>
+            <w:pPr>
+              <w:pStyle w:val="a8"/>
+              <w:ind w:left="0"/>
+              <w:rPr>
+                <w:rFonts w:ascii="Times New Roman" w:eastAsia="Times New Roman" w:hAnsi="Times New Roman" w:cs="Times New Roman"/>
+                <w:sz w:val="28"/>
+                <w:szCs w:val="28"/>
+              </w:rPr>
+            </w:pPr>
+            <w:r>
+              <w:rPr>
+                <w:rFonts w:ascii="Times New Roman" w:eastAsia="Times New Roman" w:hAnsi="Times New Roman" w:cs="Times New Roman"/>
+                <w:sz w:val="28"/>
+                <w:szCs w:val="28"/>
+              </w:rPr>
+              <w:t>55</w:t>
+            </w:r>
+          </w:p>
+        </w:tc>
+        <w:tc>
+          <w:tcPr>
+            <w:tcW w:w="2556" w:type="dxa"/>
+            <w:vAlign w:val="center"/>
+          </w:tcPr>
+          <w:p>
+            <w:pPr>
+              <w:pStyle w:val="a8"/>
+              <w:ind w:left="0"/>
+            </w:pPr>
+          </w:p>
+        </w:tc>
+        <w:tc>
+          <w:tcPr>
+            <w:tcW w:w="912" w:type="dxa"/>
+            <w:vAlign w:val="center"/>
+          </w:tcPr>
+          <w:p>
+            <w:pPr>
+              <w:pStyle w:val="a8"/>
+              <w:ind w:left="0"/>
               <w:rPr>
                 <w:rFonts w:ascii="Times New Roman" w:eastAsia="Times New Roman" w:hAnsi="Times New Roman" w:cs="Times New Roman"/>
                 <w:b/>
@@ -9941,20 +11528,215 @@
                 <w:sz w:val="28"/>
                 <w:szCs w:val="28"/>
               </w:rPr>
-              <w:t>N</w:t>
-            </w:r>
-            <w:r>
+            </w:pPr>
+            <w:r>
+              <w:t>1</w:t>
+            </w:r>
+          </w:p>
+        </w:tc>
+      </w:tr>
+      <w:tr>
+        <w:trPr>
+          <w:trHeight w:val="95"/>
+        </w:trPr>
+        <w:tc>
+          <w:tcPr>
+            <w:tcW w:w="1359" w:type="dxa"/>
+          </w:tcPr>
+          <w:p>
+            <w:pPr>
+              <w:pStyle w:val="a8"/>
+              <w:ind w:left="0"/>
+              <w:rPr>
+                <w:rFonts w:ascii="Times New Roman" w:eastAsia="Times New Roman" w:hAnsi="Times New Roman" w:cs="Times New Roman"/>
+                <w:sz w:val="28"/>
+                <w:szCs w:val="28"/>
+              </w:rPr>
+            </w:pPr>
+          </w:p>
+        </w:tc>
+        <w:tc>
+          <w:tcPr>
+            <w:tcW w:w="2733" w:type="dxa"/>
+            <w:vAlign w:val="center"/>
+          </w:tcPr>
+          <w:p>
+            <w:pPr>
+              <w:pStyle w:val="a8"/>
+              <w:ind w:left="0"/>
+            </w:pPr>
+          </w:p>
+        </w:tc>
+        <w:tc>
+          <w:tcPr>
+            <w:tcW w:w="800" w:type="dxa"/>
+          </w:tcPr>
+          <w:p>
+            <w:pPr>
+              <w:pStyle w:val="a8"/>
+              <w:ind w:left="0"/>
+              <w:rPr>
+                <w:rFonts w:ascii="Times New Roman" w:eastAsia="Times New Roman" w:hAnsi="Times New Roman" w:cs="Times New Roman"/>
+                <w:sz w:val="28"/>
+                <w:szCs w:val="28"/>
+                <w:lang w:val="ru-RU"/>
+              </w:rPr>
+            </w:pPr>
+          </w:p>
+        </w:tc>
+        <w:tc>
+          <w:tcPr>
+            <w:tcW w:w="985" w:type="dxa"/>
+          </w:tcPr>
+          <w:p>
+            <w:pPr>
+              <w:pStyle w:val="a8"/>
+              <w:ind w:left="0"/>
+              <w:rPr>
+                <w:rFonts w:ascii="Times New Roman" w:eastAsia="Times New Roman" w:hAnsi="Times New Roman" w:cs="Times New Roman"/>
+                <w:sz w:val="28"/>
+                <w:szCs w:val="28"/>
+              </w:rPr>
+            </w:pPr>
+            <w:r>
+              <w:rPr>
+                <w:rFonts w:ascii="Times New Roman" w:eastAsia="Times New Roman" w:hAnsi="Times New Roman" w:cs="Times New Roman"/>
+                <w:sz w:val="28"/>
+                <w:szCs w:val="28"/>
+              </w:rPr>
+              <w:t>56</w:t>
+            </w:r>
+          </w:p>
+        </w:tc>
+        <w:tc>
+          <w:tcPr>
+            <w:tcW w:w="2556" w:type="dxa"/>
+            <w:vAlign w:val="center"/>
+          </w:tcPr>
+          <w:p>
+            <w:pPr>
+              <w:pStyle w:val="a8"/>
+              <w:ind w:left="0"/>
+            </w:pPr>
+          </w:p>
+        </w:tc>
+        <w:tc>
+          <w:tcPr>
+            <w:tcW w:w="912" w:type="dxa"/>
+            <w:vAlign w:val="center"/>
+          </w:tcPr>
+          <w:p>
+            <w:pPr>
+              <w:pStyle w:val="a8"/>
+              <w:ind w:left="0"/>
               <w:rPr>
                 <w:rFonts w:ascii="Times New Roman" w:eastAsia="Times New Roman" w:hAnsi="Times New Roman" w:cs="Times New Roman"/>
                 <w:b/>
                 <w:bCs/>
                 <w:sz w:val="28"/>
                 <w:szCs w:val="28"/>
-                <w:vertAlign w:val="subscript"/>
-              </w:rPr>
-              <w:t>2</w:t>
-            </w:r>
-            <w:r>
+              </w:rPr>
+            </w:pPr>
+            <w:r>
+              <w:t>1</w:t>
+            </w:r>
+          </w:p>
+        </w:tc>
+      </w:tr>
+      <w:tr>
+        <w:trPr>
+          <w:trHeight w:val="95"/>
+        </w:trPr>
+        <w:tc>
+          <w:tcPr>
+            <w:tcW w:w="1359" w:type="dxa"/>
+          </w:tcPr>
+          <w:p>
+            <w:pPr>
+              <w:pStyle w:val="a8"/>
+              <w:ind w:left="0"/>
+              <w:rPr>
+                <w:rFonts w:ascii="Times New Roman" w:eastAsia="Times New Roman" w:hAnsi="Times New Roman" w:cs="Times New Roman"/>
+                <w:sz w:val="28"/>
+                <w:szCs w:val="28"/>
+              </w:rPr>
+            </w:pPr>
+          </w:p>
+        </w:tc>
+        <w:tc>
+          <w:tcPr>
+            <w:tcW w:w="2733" w:type="dxa"/>
+            <w:vAlign w:val="center"/>
+          </w:tcPr>
+          <w:p>
+            <w:pPr>
+              <w:pStyle w:val="a8"/>
+              <w:ind w:left="0"/>
+            </w:pPr>
+          </w:p>
+        </w:tc>
+        <w:tc>
+          <w:tcPr>
+            <w:tcW w:w="800" w:type="dxa"/>
+          </w:tcPr>
+          <w:p>
+            <w:pPr>
+              <w:pStyle w:val="a8"/>
+              <w:ind w:left="0"/>
+              <w:rPr>
+                <w:rFonts w:ascii="Times New Roman" w:eastAsia="Times New Roman" w:hAnsi="Times New Roman" w:cs="Times New Roman"/>
+                <w:sz w:val="28"/>
+                <w:szCs w:val="28"/>
+                <w:lang w:val="ru-RU"/>
+              </w:rPr>
+            </w:pPr>
+          </w:p>
+        </w:tc>
+        <w:tc>
+          <w:tcPr>
+            <w:tcW w:w="985" w:type="dxa"/>
+          </w:tcPr>
+          <w:p>
+            <w:pPr>
+              <w:pStyle w:val="a8"/>
+              <w:ind w:left="0"/>
+              <w:rPr>
+                <w:rFonts w:ascii="Times New Roman" w:eastAsia="Times New Roman" w:hAnsi="Times New Roman" w:cs="Times New Roman"/>
+                <w:sz w:val="28"/>
+                <w:szCs w:val="28"/>
+              </w:rPr>
+            </w:pPr>
+            <w:r>
+              <w:rPr>
+                <w:rFonts w:ascii="Times New Roman" w:eastAsia="Times New Roman" w:hAnsi="Times New Roman" w:cs="Times New Roman"/>
+                <w:sz w:val="28"/>
+                <w:szCs w:val="28"/>
+              </w:rPr>
+              <w:t>57</w:t>
+            </w:r>
+          </w:p>
+        </w:tc>
+        <w:tc>
+          <w:tcPr>
+            <w:tcW w:w="2556" w:type="dxa"/>
+            <w:vAlign w:val="center"/>
+          </w:tcPr>
+          <w:p>
+            <w:pPr>
+              <w:pStyle w:val="a8"/>
+              <w:ind w:left="0"/>
+            </w:pPr>
+          </w:p>
+        </w:tc>
+        <w:tc>
+          <w:tcPr>
+            <w:tcW w:w="912" w:type="dxa"/>
+            <w:vAlign w:val="center"/>
+          </w:tcPr>
+          <w:p>
+            <w:pPr>
+              <w:pStyle w:val="a8"/>
+              <w:ind w:left="0"/>
               <w:rPr>
                 <w:rFonts w:ascii="Times New Roman" w:eastAsia="Times New Roman" w:hAnsi="Times New Roman" w:cs="Times New Roman"/>
                 <w:b/>
@@ -9962,7 +11744,287 @@
                 <w:sz w:val="28"/>
                 <w:szCs w:val="28"/>
               </w:rPr>
+            </w:pPr>
+            <w:r>
+              <w:t>4</w:t>
+            </w:r>
+          </w:p>
+        </w:tc>
+      </w:tr>
+      <w:tr>
+        <w:trPr>
+          <w:trHeight w:val="95"/>
+        </w:trPr>
+        <w:tc>
+          <w:tcPr>
+            <w:tcW w:w="1359" w:type="dxa"/>
+          </w:tcPr>
+          <w:p>
+            <w:pPr>
+              <w:pStyle w:val="a8"/>
+              <w:ind w:left="0"/>
+              <w:rPr>
+                <w:rFonts w:ascii="Times New Roman" w:eastAsia="Times New Roman" w:hAnsi="Times New Roman" w:cs="Times New Roman"/>
+                <w:sz w:val="28"/>
+                <w:szCs w:val="28"/>
+                <w:lang w:val="ru-RU"/>
+              </w:rPr>
+            </w:pPr>
+            <w:r>
+              <w:rPr>
+                <w:rFonts w:ascii="Times New Roman" w:eastAsia="Times New Roman" w:hAnsi="Times New Roman" w:cs="Times New Roman"/>
+                <w:b/>
+                <w:bCs/>
+                <w:sz w:val="28"/>
+                <w:szCs w:val="28"/>
+              </w:rPr>
+              <w:t>η</w:t>
+            </w:r>
+            <w:r>
+              <w:rPr>
+                <w:rFonts w:ascii="Times New Roman" w:eastAsia="Times New Roman" w:hAnsi="Times New Roman" w:cs="Times New Roman"/>
+                <w:b/>
+                <w:bCs/>
+                <w:sz w:val="28"/>
+                <w:szCs w:val="28"/>
+                <w:vertAlign w:val="subscript"/>
+              </w:rPr>
+              <w:t>1</w:t>
+            </w:r>
+            <w:r>
+              <w:rPr>
+                <w:rFonts w:ascii="Times New Roman" w:eastAsia="Times New Roman" w:hAnsi="Times New Roman" w:cs="Times New Roman"/>
+                <w:b/>
+                <w:bCs/>
+                <w:sz w:val="28"/>
+                <w:szCs w:val="28"/>
+              </w:rPr>
+              <w:t xml:space="preserve"> = </w:t>
+            </w:r>
+            <w:r>
+              <w:rPr>
+                <w:rFonts w:ascii="Times New Roman" w:eastAsia="Times New Roman" w:hAnsi="Times New Roman" w:cs="Times New Roman"/>
+                <w:b/>
+                <w:bCs/>
+                <w:sz w:val="28"/>
+                <w:szCs w:val="28"/>
+                <w:lang w:val="ru-RU"/>
+              </w:rPr>
+              <w:t>42</w:t>
+            </w:r>
+          </w:p>
+        </w:tc>
+        <w:tc>
+          <w:tcPr>
+            <w:tcW w:w="2733" w:type="dxa"/>
+          </w:tcPr>
+          <w:p>
+            <w:pPr>
+              <w:pStyle w:val="a8"/>
+              <w:ind w:left="0"/>
+              <w:rPr>
+                <w:rFonts w:ascii="Times New Roman" w:eastAsia="Times New Roman" w:hAnsi="Times New Roman" w:cs="Times New Roman"/>
+                <w:sz w:val="28"/>
+                <w:szCs w:val="28"/>
+              </w:rPr>
+            </w:pPr>
+          </w:p>
+        </w:tc>
+        <w:tc>
+          <w:tcPr>
+            <w:tcW w:w="800" w:type="dxa"/>
+          </w:tcPr>
+          <w:p>
+            <w:pPr>
+              <w:pStyle w:val="a8"/>
+              <w:ind w:left="0"/>
+              <w:rPr>
+                <w:rFonts w:ascii="Times New Roman" w:eastAsia="Times New Roman" w:hAnsi="Times New Roman" w:cs="Times New Roman"/>
+                <w:b/>
+                <w:bCs/>
+                <w:sz w:val="28"/>
+                <w:szCs w:val="28"/>
+                <w:lang w:val="ru-RU"/>
+              </w:rPr>
+            </w:pPr>
+            <w:r>
+              <w:rPr>
+                <w:rFonts w:ascii="Times New Roman" w:eastAsia="Times New Roman" w:hAnsi="Times New Roman" w:cs="Times New Roman"/>
+                <w:b/>
+                <w:bCs/>
+                <w:sz w:val="28"/>
+                <w:szCs w:val="28"/>
+              </w:rPr>
+              <w:t>N</w:t>
+            </w:r>
+            <w:r>
+              <w:rPr>
+                <w:rFonts w:ascii="Times New Roman" w:eastAsia="Times New Roman" w:hAnsi="Times New Roman" w:cs="Times New Roman"/>
+                <w:b/>
+                <w:bCs/>
+                <w:sz w:val="28"/>
+                <w:szCs w:val="28"/>
+                <w:vertAlign w:val="subscript"/>
+              </w:rPr>
+              <w:t>1</w:t>
+            </w:r>
+            <w:r>
+              <w:rPr>
+                <w:rFonts w:ascii="Times New Roman" w:eastAsia="Times New Roman" w:hAnsi="Times New Roman" w:cs="Times New Roman"/>
+                <w:b/>
+                <w:bCs/>
+                <w:sz w:val="28"/>
+                <w:szCs w:val="28"/>
+              </w:rPr>
+              <w:t xml:space="preserve"> = </w:t>
+            </w:r>
+            <w:r>
+              <w:rPr>
+                <w:rFonts w:ascii="Times New Roman" w:eastAsia="Times New Roman" w:hAnsi="Times New Roman" w:cs="Times New Roman"/>
+                <w:b/>
+                <w:bCs/>
+                <w:sz w:val="28"/>
+                <w:szCs w:val="28"/>
+                <w:lang w:val="ru-RU"/>
+              </w:rPr>
+              <w:t>193</w:t>
+            </w:r>
+          </w:p>
+        </w:tc>
+        <w:tc>
+          <w:tcPr>
+            <w:tcW w:w="985" w:type="dxa"/>
+          </w:tcPr>
+          <w:p>
+            <w:pPr>
+              <w:pStyle w:val="a8"/>
+              <w:ind w:left="0"/>
+              <w:rPr>
+                <w:rFonts w:ascii="Times New Roman" w:eastAsia="Times New Roman" w:hAnsi="Times New Roman" w:cs="Times New Roman"/>
+                <w:b/>
+                <w:bCs/>
+                <w:sz w:val="28"/>
+                <w:szCs w:val="28"/>
+                <w:lang w:val="ru-RU"/>
+              </w:rPr>
+            </w:pPr>
+            <w:r>
+              <w:rPr>
+                <w:rFonts w:ascii="Times New Roman" w:eastAsia="Times New Roman" w:hAnsi="Times New Roman" w:cs="Times New Roman"/>
+                <w:b/>
+                <w:bCs/>
+                <w:sz w:val="28"/>
+                <w:szCs w:val="28"/>
+              </w:rPr>
+              <w:t>η</w:t>
+            </w:r>
+            <w:r>
+              <w:rPr>
+                <w:rFonts w:ascii="Times New Roman" w:eastAsia="Times New Roman" w:hAnsi="Times New Roman" w:cs="Times New Roman"/>
+                <w:b/>
+                <w:bCs/>
+                <w:sz w:val="28"/>
+                <w:szCs w:val="28"/>
+                <w:vertAlign w:val="subscript"/>
+              </w:rPr>
+              <w:t>2</w:t>
+            </w:r>
+            <w:r>
+              <w:rPr>
+                <w:rFonts w:ascii="Times New Roman" w:eastAsia="Times New Roman" w:hAnsi="Times New Roman" w:cs="Times New Roman"/>
+                <w:b/>
+                <w:bCs/>
+                <w:sz w:val="28"/>
+                <w:szCs w:val="28"/>
+              </w:rPr>
+              <w:t xml:space="preserve"> = </w:t>
+            </w:r>
+            <w:r>
+              <w:rPr>
+                <w:rFonts w:ascii="Times New Roman" w:eastAsia="Times New Roman" w:hAnsi="Times New Roman" w:cs="Times New Roman"/>
+                <w:b/>
+                <w:bCs/>
+                <w:sz w:val="28"/>
+                <w:szCs w:val="28"/>
+                <w:lang w:val="ru-RU"/>
+              </w:rPr>
+              <w:t>57</w:t>
+            </w:r>
+          </w:p>
+        </w:tc>
+        <w:tc>
+          <w:tcPr>
+            <w:tcW w:w="2556" w:type="dxa"/>
+          </w:tcPr>
+          <w:p>
+            <w:pPr>
+              <w:pStyle w:val="a8"/>
+              <w:ind w:left="0"/>
+              <w:rPr>
+                <w:rFonts w:ascii="Times New Roman" w:eastAsia="Times New Roman" w:hAnsi="Times New Roman" w:cs="Times New Roman"/>
+                <w:sz w:val="28"/>
+                <w:szCs w:val="28"/>
+              </w:rPr>
+            </w:pPr>
+          </w:p>
+        </w:tc>
+        <w:tc>
+          <w:tcPr>
+            <w:tcW w:w="912" w:type="dxa"/>
+          </w:tcPr>
+          <w:p>
+            <w:pPr>
+              <w:pStyle w:val="a8"/>
+              <w:ind w:left="0"/>
+              <w:rPr>
+                <w:rFonts w:ascii="Times New Roman" w:eastAsia="Times New Roman" w:hAnsi="Times New Roman" w:cs="Times New Roman"/>
+                <w:b/>
+                <w:bCs/>
+                <w:sz w:val="28"/>
+                <w:szCs w:val="28"/>
+              </w:rPr>
+            </w:pPr>
+            <w:r>
+              <w:rPr>
+                <w:rFonts w:ascii="Times New Roman" w:eastAsia="Times New Roman" w:hAnsi="Times New Roman" w:cs="Times New Roman"/>
+                <w:b/>
+                <w:bCs/>
+                <w:sz w:val="28"/>
+                <w:szCs w:val="28"/>
+              </w:rPr>
+              <w:t>N</w:t>
+            </w:r>
+            <w:r>
+              <w:rPr>
+                <w:rFonts w:ascii="Times New Roman" w:eastAsia="Times New Roman" w:hAnsi="Times New Roman" w:cs="Times New Roman"/>
+                <w:b/>
+                <w:bCs/>
+                <w:sz w:val="28"/>
+                <w:szCs w:val="28"/>
+                <w:vertAlign w:val="subscript"/>
+              </w:rPr>
+              <w:t>2</w:t>
+            </w:r>
+            <w:r>
+              <w:rPr>
+                <w:rFonts w:ascii="Times New Roman" w:eastAsia="Times New Roman" w:hAnsi="Times New Roman" w:cs="Times New Roman"/>
+                <w:b/>
+                <w:bCs/>
+                <w:sz w:val="28"/>
+                <w:szCs w:val="28"/>
+              </w:rPr>
               <w:t xml:space="preserve"> =</w:t>
+            </w:r>
+            <w:r>
+              <w:rPr>
+                <w:rFonts w:ascii="Times New Roman" w:eastAsia="Times New Roman" w:hAnsi="Times New Roman" w:cs="Times New Roman"/>
+                <w:b/>
+                <w:bCs/>
+                <w:sz w:val="28"/>
+                <w:szCs w:val="28"/>
+                <w:lang w:val="ru-RU"/>
+              </w:rPr>
+              <w:t xml:space="preserve"> 180</w:t>
             </w:r>
             <w:r>
               <w:rPr>
@@ -10039,6 +12101,15 @@
         </w:rPr>
         <w:t xml:space="preserve"> </w:t>
       </w:r>
+      <w:r>
+        <w:rPr>
+          <w:b/>
+          <w:sz w:val="28"/>
+          <w:szCs w:val="28"/>
+          <w:lang w:val="ru-RU"/>
+        </w:rPr>
+        <w:t>99</w:t>
+      </w:r>
     </w:p>
     <w:p>
       <w:pPr>
@@ -10075,6 +12146,16 @@
         </w:rPr>
         <w:t xml:space="preserve"> = </w:t>
       </w:r>
+      <w:r>
+        <w:rPr>
+          <w:b/>
+          <w:bCs/>
+          <w:sz w:val="28"/>
+          <w:szCs w:val="28"/>
+          <w:lang w:val="ru-RU"/>
+        </w:rPr>
+        <w:t>373</w:t>
+      </w:r>
     </w:p>
     <w:p>
       <w:pPr>
@@ -10112,39 +12193,16 @@
         </w:rPr>
         <w:t xml:space="preserve"> = </w:t>
       </w:r>
-    </w:p>
-    <w:p>
-      <w:pPr>
-        <w:spacing w:line="259" w:lineRule="auto"/>
-        <w:rPr>
-          <w:rFonts w:eastAsiaTheme="minorEastAsia"/>
+      <w:r>
+        <w:rPr>
+          <w:b/>
+          <w:bCs/>
           <w:sz w:val="28"/>
           <w:szCs w:val="28"/>
           <w:lang w:val="ru-RU"/>
         </w:rPr>
-      </w:pPr>
-    </w:p>
-    <w:p>
-      <w:pPr>
-        <w:spacing w:line="259" w:lineRule="auto"/>
-        <w:rPr>
-          <w:rFonts w:eastAsiaTheme="minorEastAsia"/>
-          <w:sz w:val="28"/>
-          <w:szCs w:val="28"/>
-          <w:lang w:val="ru-RU"/>
-        </w:rPr>
-      </w:pPr>
-    </w:p>
-    <w:p>
-      <w:pPr>
-        <w:spacing w:line="259" w:lineRule="auto"/>
-        <w:rPr>
-          <w:rFonts w:eastAsiaTheme="minorEastAsia"/>
-          <w:sz w:val="28"/>
-          <w:szCs w:val="28"/>
-          <w:lang w:val="ru-RU"/>
-        </w:rPr>
-      </w:pPr>
+        <w:t>2472.75</w:t>
+      </w:r>
     </w:p>
     <w:p>
       <w:pPr>
@@ -10195,7 +12253,7 @@
           <w:sz w:val="28"/>
           <w:szCs w:val="28"/>
         </w:rPr>
-        <w:t xml:space="preserve"> </w:t>
+        <w:t xml:space="preserve"> работы </w:t>
       </w:r>
       <w:proofErr w:type="spellStart"/>
       <w:r>
@@ -10206,7 +12264,7 @@
           <w:sz w:val="28"/>
           <w:szCs w:val="28"/>
         </w:rPr>
-        <w:t>работы</w:t>
+        <w:t>программы</w:t>
       </w:r>
       <w:proofErr w:type="spellEnd"/>
       <w:r>
@@ -10217,28 +12275,6 @@
           <w:sz w:val="28"/>
           <w:szCs w:val="28"/>
         </w:rPr>
-        <w:t xml:space="preserve"> </w:t>
-      </w:r>
-      <w:proofErr w:type="spellStart"/>
-      <w:r>
-        <w:rPr>
-          <w:rFonts w:ascii="Times New Roman" w:hAnsi="Times New Roman" w:cs="Times New Roman"/>
-          <w:b/>
-          <w:bCs/>
-          <w:sz w:val="28"/>
-          <w:szCs w:val="28"/>
-        </w:rPr>
-        <w:t>программы</w:t>
-      </w:r>
-      <w:proofErr w:type="spellEnd"/>
-      <w:r>
-        <w:rPr>
-          <w:rFonts w:ascii="Times New Roman" w:hAnsi="Times New Roman" w:cs="Times New Roman"/>
-          <w:b/>
-          <w:bCs/>
-          <w:sz w:val="28"/>
-          <w:szCs w:val="28"/>
-        </w:rPr>
         <w:t>:</w:t>
       </w:r>
     </w:p>
@@ -10246,9 +12282,274 @@
       <w:pPr>
         <w:pStyle w:val="ad"/>
       </w:pPr>
+      <w:r>
+        <w:rPr>
+          <w:noProof/>
+        </w:rPr>
+        <w:drawing>
+          <wp:inline distT="0" distB="0" distL="0" distR="0" wp14:anchorId="06BE473D" wp14:editId="31231040">
+            <wp:extent cx="5288382" cy="3080084"/>
+            <wp:effectExtent l="0" t="0" r="0" b="6350"/>
+            <wp:docPr id="1339474180" name="Рисунок 1"/>
+            <wp:cNvGraphicFramePr>
+              <a:graphicFrameLocks xmlns:a="http://schemas.openxmlformats.org/drawingml/2006/main" noChangeAspect="1"/>
+            </wp:cNvGraphicFramePr>
+            <a:graphic xmlns:a="http://schemas.openxmlformats.org/drawingml/2006/main">
+              <a:graphicData uri="http://schemas.openxmlformats.org/drawingml/2006/picture">
+                <pic:pic xmlns:pic="http://schemas.openxmlformats.org/drawingml/2006/picture">
+                  <pic:nvPicPr>
+                    <pic:cNvPr id="1339474180" name=""/>
+                    <pic:cNvPicPr/>
+                  </pic:nvPicPr>
+                  <pic:blipFill>
+                    <a:blip r:embed="rId8"/>
+                    <a:stretch>
+                      <a:fillRect/>
+                    </a:stretch>
+                  </pic:blipFill>
+                  <pic:spPr>
+                    <a:xfrm>
+                      <a:off x="0" y="0"/>
+                      <a:ext cx="5306936" cy="3090890"/>
+                    </a:xfrm>
+                    <a:prstGeom prst="rect">
+                      <a:avLst/>
+                    </a:prstGeom>
+                  </pic:spPr>
+                </pic:pic>
+              </a:graphicData>
+            </a:graphic>
+          </wp:inline>
+        </w:drawing>
+      </w:r>
+    </w:p>
+    <w:p>
+      <w:pPr>
+        <w:pStyle w:val="ad"/>
+      </w:pPr>
+      <w:r>
+        <w:rPr>
+          <w:noProof/>
+        </w:rPr>
+        <w:lastRenderedPageBreak/>
+        <w:drawing>
+          <wp:inline distT="0" distB="0" distL="0" distR="0" wp14:anchorId="16415E20" wp14:editId="27D08BED">
+            <wp:extent cx="5939790" cy="3740150"/>
+            <wp:effectExtent l="0" t="0" r="3810" b="6350"/>
+            <wp:docPr id="871746799" name="Рисунок 1"/>
+            <wp:cNvGraphicFramePr>
+              <a:graphicFrameLocks xmlns:a="http://schemas.openxmlformats.org/drawingml/2006/main" noChangeAspect="1"/>
+            </wp:cNvGraphicFramePr>
+            <a:graphic xmlns:a="http://schemas.openxmlformats.org/drawingml/2006/main">
+              <a:graphicData uri="http://schemas.openxmlformats.org/drawingml/2006/picture">
+                <pic:pic xmlns:pic="http://schemas.openxmlformats.org/drawingml/2006/picture">
+                  <pic:nvPicPr>
+                    <pic:cNvPr id="871746799" name=""/>
+                    <pic:cNvPicPr/>
+                  </pic:nvPicPr>
+                  <pic:blipFill>
+                    <a:blip r:embed="rId9"/>
+                    <a:stretch>
+                      <a:fillRect/>
+                    </a:stretch>
+                  </pic:blipFill>
+                  <pic:spPr>
+                    <a:xfrm>
+                      <a:off x="0" y="0"/>
+                      <a:ext cx="5939790" cy="3740150"/>
+                    </a:xfrm>
+                    <a:prstGeom prst="rect">
+                      <a:avLst/>
+                    </a:prstGeom>
+                  </pic:spPr>
+                </pic:pic>
+              </a:graphicData>
+            </a:graphic>
+          </wp:inline>
+        </w:drawing>
+      </w:r>
+    </w:p>
+    <w:p>
+      <w:pPr>
+        <w:pStyle w:val="ad"/>
+      </w:pPr>
+      <w:r>
+        <w:rPr>
+          <w:noProof/>
+        </w:rPr>
+        <w:drawing>
+          <wp:inline distT="0" distB="0" distL="0" distR="0" wp14:anchorId="784D9E4A" wp14:editId="1B2605CA">
+            <wp:extent cx="5939790" cy="3763645"/>
+            <wp:effectExtent l="0" t="0" r="3810" b="0"/>
+            <wp:docPr id="1391947502" name="Рисунок 1"/>
+            <wp:cNvGraphicFramePr>
+              <a:graphicFrameLocks xmlns:a="http://schemas.openxmlformats.org/drawingml/2006/main" noChangeAspect="1"/>
+            </wp:cNvGraphicFramePr>
+            <a:graphic xmlns:a="http://schemas.openxmlformats.org/drawingml/2006/main">
+              <a:graphicData uri="http://schemas.openxmlformats.org/drawingml/2006/picture">
+                <pic:pic xmlns:pic="http://schemas.openxmlformats.org/drawingml/2006/picture">
+                  <pic:nvPicPr>
+                    <pic:cNvPr id="1391947502" name=""/>
+                    <pic:cNvPicPr/>
+                  </pic:nvPicPr>
+                  <pic:blipFill>
+                    <a:blip r:embed="rId10"/>
+                    <a:stretch>
+                      <a:fillRect/>
+                    </a:stretch>
+                  </pic:blipFill>
+                  <pic:spPr>
+                    <a:xfrm>
+                      <a:off x="0" y="0"/>
+                      <a:ext cx="5939790" cy="3763645"/>
+                    </a:xfrm>
+                    <a:prstGeom prst="rect">
+                      <a:avLst/>
+                    </a:prstGeom>
+                  </pic:spPr>
+                </pic:pic>
+              </a:graphicData>
+            </a:graphic>
+          </wp:inline>
+        </w:drawing>
+      </w:r>
+    </w:p>
+    <w:p>
+      <w:pPr>
+        <w:pStyle w:val="ad"/>
+      </w:pPr>
+      <w:r>
+        <w:rPr>
+          <w:noProof/>
+        </w:rPr>
+        <w:lastRenderedPageBreak/>
+        <w:drawing>
+          <wp:inline distT="0" distB="0" distL="0" distR="0" wp14:anchorId="2DD29466" wp14:editId="4D40DE2D">
+            <wp:extent cx="2606400" cy="2368800"/>
+            <wp:effectExtent l="0" t="0" r="0" b="0"/>
+            <wp:docPr id="1930815882" name="Рисунок 1"/>
+            <wp:cNvGraphicFramePr>
+              <a:graphicFrameLocks xmlns:a="http://schemas.openxmlformats.org/drawingml/2006/main" noChangeAspect="1"/>
+            </wp:cNvGraphicFramePr>
+            <a:graphic xmlns:a="http://schemas.openxmlformats.org/drawingml/2006/main">
+              <a:graphicData uri="http://schemas.openxmlformats.org/drawingml/2006/picture">
+                <pic:pic xmlns:pic="http://schemas.openxmlformats.org/drawingml/2006/picture">
+                  <pic:nvPicPr>
+                    <pic:cNvPr id="1930815882" name=""/>
+                    <pic:cNvPicPr/>
+                  </pic:nvPicPr>
+                  <pic:blipFill>
+                    <a:blip r:embed="rId11"/>
+                    <a:stretch>
+                      <a:fillRect/>
+                    </a:stretch>
+                  </pic:blipFill>
+                  <pic:spPr>
+                    <a:xfrm>
+                      <a:off x="0" y="0"/>
+                      <a:ext cx="2606400" cy="2368800"/>
+                    </a:xfrm>
+                    <a:prstGeom prst="rect">
+                      <a:avLst/>
+                    </a:prstGeom>
+                  </pic:spPr>
+                </pic:pic>
+              </a:graphicData>
+            </a:graphic>
+          </wp:inline>
+        </w:drawing>
+      </w:r>
+      <w:r>
+        <w:rPr>
+          <w:noProof/>
+        </w:rPr>
+        <w:drawing>
+          <wp:inline distT="0" distB="0" distL="0" distR="0" wp14:anchorId="63EE7C8E" wp14:editId="4F2D3691">
+            <wp:extent cx="3263900" cy="4495800"/>
+            <wp:effectExtent l="0" t="0" r="0" b="0"/>
+            <wp:docPr id="1797682170" name="Рисунок 1"/>
+            <wp:cNvGraphicFramePr>
+              <a:graphicFrameLocks xmlns:a="http://schemas.openxmlformats.org/drawingml/2006/main" noChangeAspect="1"/>
+            </wp:cNvGraphicFramePr>
+            <a:graphic xmlns:a="http://schemas.openxmlformats.org/drawingml/2006/main">
+              <a:graphicData uri="http://schemas.openxmlformats.org/drawingml/2006/picture">
+                <pic:pic xmlns:pic="http://schemas.openxmlformats.org/drawingml/2006/picture">
+                  <pic:nvPicPr>
+                    <pic:cNvPr id="1797682170" name=""/>
+                    <pic:cNvPicPr/>
+                  </pic:nvPicPr>
+                  <pic:blipFill>
+                    <a:blip r:embed="rId12"/>
+                    <a:stretch>
+                      <a:fillRect/>
+                    </a:stretch>
+                  </pic:blipFill>
+                  <pic:spPr>
+                    <a:xfrm>
+                      <a:off x="0" y="0"/>
+                      <a:ext cx="3263900" cy="4495800"/>
+                    </a:xfrm>
+                    <a:prstGeom prst="rect">
+                      <a:avLst/>
+                    </a:prstGeom>
+                  </pic:spPr>
+                </pic:pic>
+              </a:graphicData>
+            </a:graphic>
+          </wp:inline>
+        </w:drawing>
+      </w:r>
+    </w:p>
+    <w:p>
+      <w:pPr>
+        <w:pStyle w:val="ad"/>
+      </w:pPr>
+      <w:r>
+        <w:t xml:space="preserve">                                                           </w:t>
+      </w:r>
+      <w:r>
+        <w:rPr>
+          <w:noProof/>
+        </w:rPr>
+        <w:drawing>
+          <wp:inline distT="0" distB="0" distL="0" distR="0" wp14:anchorId="72C6D499" wp14:editId="50D6D396">
+            <wp:extent cx="3213100" cy="2616200"/>
+            <wp:effectExtent l="0" t="0" r="0" b="0"/>
+            <wp:docPr id="2117186612" name="Рисунок 1"/>
+            <wp:cNvGraphicFramePr>
+              <a:graphicFrameLocks xmlns:a="http://schemas.openxmlformats.org/drawingml/2006/main" noChangeAspect="1"/>
+            </wp:cNvGraphicFramePr>
+            <a:graphic xmlns:a="http://schemas.openxmlformats.org/drawingml/2006/main">
+              <a:graphicData uri="http://schemas.openxmlformats.org/drawingml/2006/picture">
+                <pic:pic xmlns:pic="http://schemas.openxmlformats.org/drawingml/2006/picture">
+                  <pic:nvPicPr>
+                    <pic:cNvPr id="2117186612" name=""/>
+                    <pic:cNvPicPr/>
+                  </pic:nvPicPr>
+                  <pic:blipFill>
+                    <a:blip r:embed="rId13"/>
+                    <a:stretch>
+                      <a:fillRect/>
+                    </a:stretch>
+                  </pic:blipFill>
+                  <pic:spPr>
+                    <a:xfrm>
+                      <a:off x="0" y="0"/>
+                      <a:ext cx="3213100" cy="2616200"/>
+                    </a:xfrm>
+                    <a:prstGeom prst="rect">
+                      <a:avLst/>
+                    </a:prstGeom>
+                  </pic:spPr>
+                </pic:pic>
+              </a:graphicData>
+            </a:graphic>
+          </wp:inline>
+        </w:drawing>
+      </w:r>
     </w:p>
     <w:sectPr>
-      <w:footerReference w:type="default" r:id="rId8"/>
+      <w:footerReference w:type="default" r:id="rId14"/>
       <w:pgSz w:w="11906" w:h="16838"/>
       <w:pgMar w:top="1134" w:right="851" w:bottom="1531" w:left="1701" w:header="0" w:footer="0" w:gutter="0"/>
       <w:pgNumType w:start="0"/>

</xml_diff>